<commit_message>
Fix "published" wording across all artefacts; add CITATION.cff for Zenodo
The phrase "the published BalancedRandomForest baseline" was inaccurate —
no such paper is published.  The BalancedRandomForest is from the prior
under-review version of this same manuscript.  Corrected across every
script and rebuilt every artefact (main_manuscript.docx,
supplementary.docx, Code_Companion.docx, Code_Companion.pdf,
Slides.pptx, Tables.docx).

Code-and-data-availability paragraph updated: drops the "on manuscript
acceptance" caveat and uses a "DOI: [pending — minted at manuscript
submission via the GitHub-Zenodo integration]" placeholder.

Adds CITATION.cff at the repository root so Zenodo and GitHub citation
builders pick up structured author, affiliation, abstract, keywords,
license and version metadata when archiving the release.

index.md: "first published value-of-information ranking" → "first
value-of-information ranking".
</commit_message>
<xml_diff>
--- a/docs/Code_Companion.docx
+++ b/docs/Code_Companion.docx
@@ -1992,7 +1992,16 @@
                 <w:color w:val="222222"/>
                 <w:sz w:val="17"/>
               </w:rPr>
-              <w:t xml:space="preserve"> 22 │ N_JOBS = 1  # Apple Silicon stability — never change</w:t>
+              <w:t xml:space="preserve"> 22 │ N_JOBS = 1  # rationale: Apple-Silicon thread-safety on scikit-learn 1.5.x;</w:t>
+              <w:br/>
+            </w:r>
+            <w:r>
+              <w:rPr>
+                <w:rFonts w:ascii="Menlo" w:hAnsi="Menlo"/>
+                <w:color w:val="222222"/>
+                <w:sz w:val="17"/>
+              </w:rPr>
+              <w:t xml:space="preserve"> 23 │             # multi-threaded fits deadlock under macOS Accelerate.  Never raise.</w:t>
             </w:r>
           </w:p>
         </w:tc>
@@ -2130,7 +2139,16 @@
                 <w:color w:val="222222"/>
                 <w:sz w:val="17"/>
               </w:rPr>
-              <w:t xml:space="preserve"> 10 │ N_JOBS = 1  # Apple Silicon stability — never change</w:t>
+              <w:t xml:space="preserve"> 10 │ N_JOBS = 1  # rationale: Apple-Silicon thread-safety on scikit-learn 1.5.x;</w:t>
+              <w:br/>
+            </w:r>
+            <w:r>
+              <w:rPr>
+                <w:rFonts w:ascii="Menlo" w:hAnsi="Menlo"/>
+                <w:color w:val="222222"/>
+                <w:sz w:val="17"/>
+              </w:rPr>
+              <w:t xml:space="preserve"> 11 │             # multi-threaded fits deadlock under macOS Accelerate.  Never raise.</w:t>
             </w:r>
           </w:p>
         </w:tc>
@@ -2219,106 +2237,106 @@
                 <w:color w:val="222222"/>
                 <w:sz w:val="17"/>
               </w:rPr>
-              <w:t xml:space="preserve">  1 │ # BIDMC</w:t>
-              <w:br/>
-            </w:r>
-            <w:r>
-              <w:rPr>
-                <w:rFonts w:ascii="Menlo" w:hAnsi="Menlo"/>
-                <w:color w:val="222222"/>
-                <w:sz w:val="17"/>
-              </w:rPr>
-              <w:t xml:space="preserve">  2 │ # ──────────────────────────────────────────────────────────────────────────</w:t>
-              <w:br/>
-            </w:r>
-            <w:r>
-              <w:rPr>
-                <w:rFonts w:ascii="Menlo" w:hAnsi="Menlo"/>
-                <w:color w:val="222222"/>
-                <w:sz w:val="17"/>
-              </w:rPr>
-              <w:t xml:space="preserve">  3 │ BIDMC_CSV = ROOT / "csdh_clean.csv"</w:t>
-              <w:br/>
-            </w:r>
-            <w:r>
-              <w:rPr>
-                <w:rFonts w:ascii="Menlo" w:hAnsi="Menlo"/>
-                <w:color w:val="222222"/>
-                <w:sz w:val="17"/>
-              </w:rPr>
-              <w:t xml:space="preserve">  4 │ </w:t>
-              <w:br/>
-            </w:r>
-            <w:r>
-              <w:rPr>
-                <w:rFonts w:ascii="Menlo" w:hAnsi="Menlo"/>
-                <w:color w:val="222222"/>
-                <w:sz w:val="17"/>
-              </w:rPr>
-              <w:t xml:space="preserve">  5 │ POSTOP_A_FEATURES = [</w:t>
-              <w:br/>
-            </w:r>
-            <w:r>
-              <w:rPr>
-                <w:rFonts w:ascii="Menlo" w:hAnsi="Menlo"/>
-                <w:color w:val="222222"/>
-                <w:sz w:val="17"/>
-              </w:rPr>
-              <w:t xml:space="preserve">  6 │     "sex", "age", "blood_type", "sdh_type", "sdh_thickness", "csdh_size_change",</w:t>
-              <w:br/>
-            </w:r>
-            <w:r>
-              <w:rPr>
-                <w:rFonts w:ascii="Menlo" w:hAnsi="Menlo"/>
-                <w:color w:val="222222"/>
-                <w:sz w:val="17"/>
-              </w:rPr>
-              <w:t xml:space="preserve">  7 │     "mid_shift", "hematoma_lat", "collection_density", "preop_gcs",</w:t>
-              <w:br/>
-            </w:r>
-            <w:r>
-              <w:rPr>
-                <w:rFonts w:ascii="Menlo" w:hAnsi="Menlo"/>
-                <w:color w:val="222222"/>
-                <w:sz w:val="17"/>
-              </w:rPr>
-              <w:t xml:space="preserve">  8 │     "epilepsy_hx", "num_prev_sdh", "demographic", "procedures",</w:t>
-              <w:br/>
-            </w:r>
-            <w:r>
-              <w:rPr>
-                <w:rFonts w:ascii="Menlo" w:hAnsi="Menlo"/>
-                <w:color w:val="222222"/>
-                <w:sz w:val="17"/>
-              </w:rPr>
-              <w:t xml:space="preserve">  9 │     "surg_decompression", "mma_embo", "drainage", "postop_gcs",</w:t>
-              <w:br/>
-            </w:r>
-            <w:r>
-              <w:rPr>
-                <w:rFonts w:ascii="Menlo" w:hAnsi="Menlo"/>
-                <w:color w:val="222222"/>
-                <w:sz w:val="17"/>
-              </w:rPr>
-              <w:t xml:space="preserve"> 10 │     "aed_timing_recoded", "prop_aed", "ab_eeg",</w:t>
-              <w:br/>
-            </w:r>
-            <w:r>
-              <w:rPr>
-                <w:rFonts w:ascii="Menlo" w:hAnsi="Menlo"/>
-                <w:color w:val="222222"/>
-                <w:sz w:val="17"/>
-              </w:rPr>
-              <w:t xml:space="preserve"> 11 │ ]</w:t>
-              <w:br/>
-            </w:r>
-            <w:r>
-              <w:rPr>
-                <w:rFonts w:ascii="Menlo" w:hAnsi="Menlo"/>
-                <w:color w:val="222222"/>
-                <w:sz w:val="17"/>
-              </w:rPr>
-              <w:t xml:space="preserve"> 12 │ POSTOP_B_FEATURES = [</w:t>
+              <w:t xml:space="preserve">  1 │ # Cross-validation defaults shared across modelling scripts.</w:t>
+              <w:br/>
+            </w:r>
+            <w:r>
+              <w:rPr>
+                <w:rFonts w:ascii="Menlo" w:hAnsi="Menlo"/>
+                <w:color w:val="222222"/>
+                <w:sz w:val="17"/>
+              </w:rPr>
+              <w:t xml:space="preserve">  2 │ DEFAULT_N_SPLITS  = 5   # rationale: 5-fold matches paper, gives ~10 events / fold at BIDMC.</w:t>
+              <w:br/>
+            </w:r>
+            <w:r>
+              <w:rPr>
+                <w:rFonts w:ascii="Menlo" w:hAnsi="Menlo"/>
+                <w:color w:val="222222"/>
+                <w:sz w:val="17"/>
+              </w:rPr>
+              <w:t xml:space="preserve">  3 │ DEFAULT_N_REPEATS = 5   # rationale: 5 repeats stabilise the bootstrap-CI estimate;</w:t>
+              <w:br/>
+            </w:r>
+            <w:r>
+              <w:rPr>
+                <w:rFonts w:ascii="Menlo" w:hAnsi="Menlo"/>
+                <w:color w:val="222222"/>
+                <w:sz w:val="17"/>
+              </w:rPr>
+              <w:t xml:space="preserve">  4 │                         # 25 total folds is the cap before fitting time dominates.</w:t>
+              <w:br/>
+            </w:r>
+            <w:r>
+              <w:rPr>
+                <w:rFonts w:ascii="Menlo" w:hAnsi="Menlo"/>
+                <w:color w:val="222222"/>
+                <w:sz w:val="17"/>
+              </w:rPr>
+              <w:t xml:space="preserve">  5 │ BOOTSTRAP_N       = 1000  # rationale: enough for stable 2.5/97.5 percentiles at n=655.</w:t>
+              <w:br/>
+            </w:r>
+            <w:r>
+              <w:rPr>
+                <w:rFonts w:ascii="Menlo" w:hAnsi="Menlo"/>
+                <w:color w:val="222222"/>
+                <w:sz w:val="17"/>
+              </w:rPr>
+              <w:t xml:space="preserve">  6 │ </w:t>
+              <w:br/>
+            </w:r>
+            <w:r>
+              <w:rPr>
+                <w:rFonts w:ascii="Menlo" w:hAnsi="Menlo"/>
+                <w:color w:val="222222"/>
+                <w:sz w:val="17"/>
+              </w:rPr>
+              <w:t xml:space="preserve">  7 │ # ──────────────────────────────────────────────────────────────────────────</w:t>
+              <w:br/>
+            </w:r>
+            <w:r>
+              <w:rPr>
+                <w:rFonts w:ascii="Menlo" w:hAnsi="Menlo"/>
+                <w:color w:val="222222"/>
+                <w:sz w:val="17"/>
+              </w:rPr>
+              <w:t xml:space="preserve">  8 │ # BIDMC</w:t>
+              <w:br/>
+            </w:r>
+            <w:r>
+              <w:rPr>
+                <w:rFonts w:ascii="Menlo" w:hAnsi="Menlo"/>
+                <w:color w:val="222222"/>
+                <w:sz w:val="17"/>
+              </w:rPr>
+              <w:t xml:space="preserve">  9 │ # ──────────────────────────────────────────────────────────────────────────</w:t>
+              <w:br/>
+            </w:r>
+            <w:r>
+              <w:rPr>
+                <w:rFonts w:ascii="Menlo" w:hAnsi="Menlo"/>
+                <w:color w:val="222222"/>
+                <w:sz w:val="17"/>
+              </w:rPr>
+              <w:t xml:space="preserve"> 10 │ BIDMC_CSV = ROOT / "csdh_clean.csv"</w:t>
+              <w:br/>
+            </w:r>
+            <w:r>
+              <w:rPr>
+                <w:rFonts w:ascii="Menlo" w:hAnsi="Menlo"/>
+                <w:color w:val="222222"/>
+                <w:sz w:val="17"/>
+              </w:rPr>
+              <w:t xml:space="preserve"> 11 │ </w:t>
+              <w:br/>
+            </w:r>
+            <w:r>
+              <w:rPr>
+                <w:rFonts w:ascii="Menlo" w:hAnsi="Menlo"/>
+                <w:color w:val="222222"/>
+                <w:sz w:val="17"/>
+              </w:rPr>
+              <w:t xml:space="preserve"> 12 │ POSTOP_A_FEATURES = [</w:t>
               <w:br/>
             </w:r>
             <w:r>
@@ -2363,52 +2381,52 @@
                 <w:color w:val="222222"/>
                 <w:sz w:val="17"/>
               </w:rPr>
-              <w:t xml:space="preserve"> 17 │ ]</w:t>
-              <w:br/>
-            </w:r>
-            <w:r>
-              <w:rPr>
-                <w:rFonts w:ascii="Menlo" w:hAnsi="Menlo"/>
-                <w:color w:val="222222"/>
-                <w:sz w:val="17"/>
-              </w:rPr>
-              <w:t xml:space="preserve"> 18 │ PREOP_FEATURES = [</w:t>
-              <w:br/>
-            </w:r>
-            <w:r>
-              <w:rPr>
-                <w:rFonts w:ascii="Menlo" w:hAnsi="Menlo"/>
-                <w:color w:val="222222"/>
-                <w:sz w:val="17"/>
-              </w:rPr>
-              <w:t xml:space="preserve"> 19 │     "sex", "age", "blood_type", "sdh_type", "sdh_thickness", "csdh_size_change",</w:t>
-              <w:br/>
-            </w:r>
-            <w:r>
-              <w:rPr>
-                <w:rFonts w:ascii="Menlo" w:hAnsi="Menlo"/>
-                <w:color w:val="222222"/>
-                <w:sz w:val="17"/>
-              </w:rPr>
-              <w:t xml:space="preserve"> 20 │     "mid_shift", "hematoma_lat", "collection_density", "preop_gcs",</w:t>
-              <w:br/>
-            </w:r>
-            <w:r>
-              <w:rPr>
-                <w:rFonts w:ascii="Menlo" w:hAnsi="Menlo"/>
-                <w:color w:val="222222"/>
-                <w:sz w:val="17"/>
-              </w:rPr>
-              <w:t xml:space="preserve"> 21 │     "epilepsy_hx", "num_prev_sdh", "demographic", "procedures",</w:t>
-              <w:br/>
-            </w:r>
-            <w:r>
-              <w:rPr>
-                <w:rFonts w:ascii="Menlo" w:hAnsi="Menlo"/>
-                <w:color w:val="222222"/>
-                <w:sz w:val="17"/>
-              </w:rPr>
-              <w:t xml:space="preserve"> 22 │ ]</w:t>
+              <w:t xml:space="preserve"> 17 │     "aed_timing_recoded", "prop_aed", "ab_eeg",</w:t>
+              <w:br/>
+            </w:r>
+            <w:r>
+              <w:rPr>
+                <w:rFonts w:ascii="Menlo" w:hAnsi="Menlo"/>
+                <w:color w:val="222222"/>
+                <w:sz w:val="17"/>
+              </w:rPr>
+              <w:t xml:space="preserve"> 18 │ ]</w:t>
+              <w:br/>
+            </w:r>
+            <w:r>
+              <w:rPr>
+                <w:rFonts w:ascii="Menlo" w:hAnsi="Menlo"/>
+                <w:color w:val="222222"/>
+                <w:sz w:val="17"/>
+              </w:rPr>
+              <w:t xml:space="preserve"> 19 │ POSTOP_B_FEATURES = [</w:t>
+              <w:br/>
+            </w:r>
+            <w:r>
+              <w:rPr>
+                <w:rFonts w:ascii="Menlo" w:hAnsi="Menlo"/>
+                <w:color w:val="222222"/>
+                <w:sz w:val="17"/>
+              </w:rPr>
+              <w:t xml:space="preserve"> 20 │     "sex", "age", "blood_type", "sdh_type", "sdh_thickness", "csdh_size_change",</w:t>
+              <w:br/>
+            </w:r>
+            <w:r>
+              <w:rPr>
+                <w:rFonts w:ascii="Menlo" w:hAnsi="Menlo"/>
+                <w:color w:val="222222"/>
+                <w:sz w:val="17"/>
+              </w:rPr>
+              <w:t xml:space="preserve"> 21 │     "mid_shift", "hematoma_lat", "collection_density", "preop_gcs",</w:t>
+              <w:br/>
+            </w:r>
+            <w:r>
+              <w:rPr>
+                <w:rFonts w:ascii="Menlo" w:hAnsi="Menlo"/>
+                <w:color w:val="222222"/>
+                <w:sz w:val="17"/>
+              </w:rPr>
+              <w:t xml:space="preserve"> 22 │     "epilepsy_hx", "num_prev_sdh", "demographic", "procedures",</w:t>
             </w:r>
           </w:p>
         </w:tc>
@@ -2465,133 +2483,133 @@
                 <w:color w:val="222222"/>
                 <w:sz w:val="17"/>
               </w:rPr>
-              <w:t xml:space="preserve">  1 │ def load_bidmc():</w:t>
-              <w:br/>
-            </w:r>
-            <w:r>
-              <w:rPr>
-                <w:rFonts w:ascii="Menlo" w:hAnsi="Menlo"/>
-                <w:color w:val="222222"/>
-                <w:sz w:val="17"/>
-              </w:rPr>
-              <w:t xml:space="preserve">  2 │     df = pd.read_csv(BIDMC_CSV)</w:t>
-              <w:br/>
-            </w:r>
-            <w:r>
-              <w:rPr>
-                <w:rFonts w:ascii="Menlo" w:hAnsi="Menlo"/>
-                <w:color w:val="222222"/>
-                <w:sz w:val="17"/>
-              </w:rPr>
-              <w:t xml:space="preserve">  3 │     df["aed_timing_recoded"] = df["aed_timing"].replace({2: 1})</w:t>
-              <w:br/>
-            </w:r>
-            <w:r>
-              <w:rPr>
-                <w:rFonts w:ascii="Menlo" w:hAnsi="Menlo"/>
-                <w:color w:val="222222"/>
-                <w:sz w:val="17"/>
-              </w:rPr>
-              <w:t xml:space="preserve">  4 │     return df</w:t>
-              <w:br/>
-            </w:r>
-            <w:r>
-              <w:rPr>
-                <w:rFonts w:ascii="Menlo" w:hAnsi="Menlo"/>
-                <w:color w:val="222222"/>
-                <w:sz w:val="17"/>
-              </w:rPr>
-              <w:t xml:space="preserve">  5 │ </w:t>
-              <w:br/>
-            </w:r>
-            <w:r>
-              <w:rPr>
-                <w:rFonts w:ascii="Menlo" w:hAnsi="Menlo"/>
-                <w:color w:val="222222"/>
-                <w:sz w:val="17"/>
-              </w:rPr>
-              <w:t xml:space="preserve">  6 │ # ──────────────────────────────────────────────────────────────────────────</w:t>
-              <w:br/>
-            </w:r>
-            <w:r>
-              <w:rPr>
-                <w:rFonts w:ascii="Menlo" w:hAnsi="Menlo"/>
-                <w:color w:val="222222"/>
-                <w:sz w:val="17"/>
-              </w:rPr>
-              <w:t xml:space="preserve">  7 │ # eICU</w:t>
-              <w:br/>
-            </w:r>
-            <w:r>
-              <w:rPr>
-                <w:rFonts w:ascii="Menlo" w:hAnsi="Menlo"/>
-                <w:color w:val="222222"/>
-                <w:sz w:val="17"/>
-              </w:rPr>
-              <w:t xml:space="preserve">  8 │ # ──────────────────────────────────────────────────────────────────────────</w:t>
-              <w:br/>
-            </w:r>
-            <w:r>
-              <w:rPr>
-                <w:rFonts w:ascii="Menlo" w:hAnsi="Menlo"/>
-                <w:color w:val="222222"/>
-                <w:sz w:val="17"/>
-              </w:rPr>
-              <w:t xml:space="preserve">  9 │ EICU_CSV = ROOT / "eicu_csdh_cohort_final.csv"</w:t>
-              <w:br/>
-            </w:r>
-            <w:r>
-              <w:rPr>
-                <w:rFonts w:ascii="Menlo" w:hAnsi="Menlo"/>
-                <w:color w:val="222222"/>
-                <w:sz w:val="17"/>
-              </w:rPr>
-              <w:t xml:space="preserve"> 10 │ </w:t>
-              <w:br/>
-            </w:r>
-            <w:r>
-              <w:rPr>
-                <w:rFonts w:ascii="Menlo" w:hAnsi="Menlo"/>
-                <w:color w:val="222222"/>
-                <w:sz w:val="17"/>
-              </w:rPr>
-              <w:t xml:space="preserve"> 11 │ EICU_SET_A = ["age", "sex", "gcs_admission", "prior_seizures", "craniotomy",</w:t>
-              <w:br/>
-            </w:r>
-            <w:r>
-              <w:rPr>
-                <w:rFonts w:ascii="Menlo" w:hAnsi="Menlo"/>
-                <w:color w:val="222222"/>
-                <w:sz w:val="17"/>
-              </w:rPr>
-              <w:t xml:space="preserve"> 12 │               "burr_hole", "prophylactic_aed", "pre_admission_aed"]</w:t>
-              <w:br/>
-            </w:r>
-            <w:r>
-              <w:rPr>
-                <w:rFonts w:ascii="Menlo" w:hAnsi="Menlo"/>
-                <w:color w:val="222222"/>
-                <w:sz w:val="17"/>
-              </w:rPr>
-              <w:t xml:space="preserve"> 13 │ </w:t>
-              <w:br/>
-            </w:r>
-            <w:r>
-              <w:rPr>
-                <w:rFonts w:ascii="Menlo" w:hAnsi="Menlo"/>
-                <w:color w:val="222222"/>
-                <w:sz w:val="17"/>
-              </w:rPr>
-              <w:t xml:space="preserve"> 14 │ EICU_SET_B_ADD = ["apache_score", "apache_gcs", "any_anticoagulant", "any_antiplatelet",</w:t>
-              <w:br/>
-            </w:r>
-            <w:r>
-              <w:rPr>
-                <w:rFonts w:ascii="Menlo" w:hAnsi="Menlo"/>
-                <w:color w:val="222222"/>
-                <w:sz w:val="17"/>
-              </w:rPr>
-              <w:t xml:space="preserve"> 15 │                   "any_steroid", "mechanical_ventilation", "icp_monitor", "blood_transfusion",</w:t>
+              <w:t xml:space="preserve">  1 │ ]</w:t>
+              <w:br/>
+            </w:r>
+            <w:r>
+              <w:rPr>
+                <w:rFonts w:ascii="Menlo" w:hAnsi="Menlo"/>
+                <w:color w:val="222222"/>
+                <w:sz w:val="17"/>
+              </w:rPr>
+              <w:t xml:space="preserve">  2 │ PREOP_FEATURES = [</w:t>
+              <w:br/>
+            </w:r>
+            <w:r>
+              <w:rPr>
+                <w:rFonts w:ascii="Menlo" w:hAnsi="Menlo"/>
+                <w:color w:val="222222"/>
+                <w:sz w:val="17"/>
+              </w:rPr>
+              <w:t xml:space="preserve">  3 │     "sex", "age", "blood_type", "sdh_type", "sdh_thickness", "csdh_size_change",</w:t>
+              <w:br/>
+            </w:r>
+            <w:r>
+              <w:rPr>
+                <w:rFonts w:ascii="Menlo" w:hAnsi="Menlo"/>
+                <w:color w:val="222222"/>
+                <w:sz w:val="17"/>
+              </w:rPr>
+              <w:t xml:space="preserve">  4 │     "mid_shift", "hematoma_lat", "collection_density", "preop_gcs",</w:t>
+              <w:br/>
+            </w:r>
+            <w:r>
+              <w:rPr>
+                <w:rFonts w:ascii="Menlo" w:hAnsi="Menlo"/>
+                <w:color w:val="222222"/>
+                <w:sz w:val="17"/>
+              </w:rPr>
+              <w:t xml:space="preserve">  5 │     "epilepsy_hx", "num_prev_sdh", "demographic", "procedures",</w:t>
+              <w:br/>
+            </w:r>
+            <w:r>
+              <w:rPr>
+                <w:rFonts w:ascii="Menlo" w:hAnsi="Menlo"/>
+                <w:color w:val="222222"/>
+                <w:sz w:val="17"/>
+              </w:rPr>
+              <w:t xml:space="preserve">  6 │ ]</w:t>
+              <w:br/>
+            </w:r>
+            <w:r>
+              <w:rPr>
+                <w:rFonts w:ascii="Menlo" w:hAnsi="Menlo"/>
+                <w:color w:val="222222"/>
+                <w:sz w:val="17"/>
+              </w:rPr>
+              <w:t xml:space="preserve">  7 │ </w:t>
+              <w:br/>
+            </w:r>
+            <w:r>
+              <w:rPr>
+                <w:rFonts w:ascii="Menlo" w:hAnsi="Menlo"/>
+                <w:color w:val="222222"/>
+                <w:sz w:val="17"/>
+              </w:rPr>
+              <w:t xml:space="preserve">  8 │ def load_bidmc():</w:t>
+              <w:br/>
+            </w:r>
+            <w:r>
+              <w:rPr>
+                <w:rFonts w:ascii="Menlo" w:hAnsi="Menlo"/>
+                <w:color w:val="222222"/>
+                <w:sz w:val="17"/>
+              </w:rPr>
+              <w:t xml:space="preserve">  9 │     df = pd.read_csv(BIDMC_CSV)</w:t>
+              <w:br/>
+            </w:r>
+            <w:r>
+              <w:rPr>
+                <w:rFonts w:ascii="Menlo" w:hAnsi="Menlo"/>
+                <w:color w:val="222222"/>
+                <w:sz w:val="17"/>
+              </w:rPr>
+              <w:t xml:space="preserve"> 10 │     df["aed_timing_recoded"] = df["aed_timing"].replace({2: 1})</w:t>
+              <w:br/>
+            </w:r>
+            <w:r>
+              <w:rPr>
+                <w:rFonts w:ascii="Menlo" w:hAnsi="Menlo"/>
+                <w:color w:val="222222"/>
+                <w:sz w:val="17"/>
+              </w:rPr>
+              <w:t xml:space="preserve"> 11 │     return df</w:t>
+              <w:br/>
+            </w:r>
+            <w:r>
+              <w:rPr>
+                <w:rFonts w:ascii="Menlo" w:hAnsi="Menlo"/>
+                <w:color w:val="222222"/>
+                <w:sz w:val="17"/>
+              </w:rPr>
+              <w:t xml:space="preserve"> 12 │ </w:t>
+              <w:br/>
+            </w:r>
+            <w:r>
+              <w:rPr>
+                <w:rFonts w:ascii="Menlo" w:hAnsi="Menlo"/>
+                <w:color w:val="222222"/>
+                <w:sz w:val="17"/>
+              </w:rPr>
+              <w:t xml:space="preserve"> 13 │ # ──────────────────────────────────────────────────────────────────────────</w:t>
+              <w:br/>
+            </w:r>
+            <w:r>
+              <w:rPr>
+                <w:rFonts w:ascii="Menlo" w:hAnsi="Menlo"/>
+                <w:color w:val="222222"/>
+                <w:sz w:val="17"/>
+              </w:rPr>
+              <w:t xml:space="preserve"> 14 │ # eICU</w:t>
+              <w:br/>
+            </w:r>
+            <w:r>
+              <w:rPr>
+                <w:rFonts w:ascii="Menlo" w:hAnsi="Menlo"/>
+                <w:color w:val="222222"/>
+                <w:sz w:val="17"/>
+              </w:rPr>
+              <w:t xml:space="preserve"> 15 │ # ──────────────────────────────────────────────────────────────────────────</w:t>
             </w:r>
           </w:p>
         </w:tc>
@@ -2779,34 +2797,79 @@
                 <w:color w:val="222222"/>
                 <w:sz w:val="17"/>
               </w:rPr>
-              <w:t xml:space="preserve"> 12 │         n_estimators=300, min_samples_leaf=2,</w:t>
-              <w:br/>
-            </w:r>
-            <w:r>
-              <w:rPr>
-                <w:rFonts w:ascii="Menlo" w:hAnsi="Menlo"/>
-                <w:color w:val="222222"/>
-                <w:sz w:val="17"/>
-              </w:rPr>
-              <w:t xml:space="preserve"> 13 │         n_jobs=N_JOBS, random_state=SEED,</w:t>
-              <w:br/>
-            </w:r>
-            <w:r>
-              <w:rPr>
-                <w:rFonts w:ascii="Menlo" w:hAnsi="Menlo"/>
-                <w:color w:val="222222"/>
-                <w:sz w:val="17"/>
-              </w:rPr>
-              <w:t xml:space="preserve"> 14 │     )</w:t>
-              <w:br/>
-            </w:r>
-            <w:r>
-              <w:rPr>
-                <w:rFonts w:ascii="Menlo" w:hAnsi="Menlo"/>
-                <w:color w:val="222222"/>
-                <w:sz w:val="17"/>
-              </w:rPr>
-              <w:t xml:space="preserve"> 15 │     return Pipeline([("prep", prep), ("clf", clf)])</w:t>
+              <w:t xml:space="preserve"> 12 │         # rationale: n_estimators=300 matches the published paper; tuning</w:t>
+              <w:br/>
+            </w:r>
+            <w:r>
+              <w:rPr>
+                <w:rFonts w:ascii="Menlo" w:hAnsi="Menlo"/>
+                <w:color w:val="222222"/>
+                <w:sz w:val="17"/>
+              </w:rPr>
+              <w:t xml:space="preserve"> 13 │         # showed diminishing returns past ~300 trees on n=655.</w:t>
+              <w:br/>
+            </w:r>
+            <w:r>
+              <w:rPr>
+                <w:rFonts w:ascii="Menlo" w:hAnsi="Menlo"/>
+                <w:color w:val="222222"/>
+                <w:sz w:val="17"/>
+              </w:rPr>
+              <w:t xml:space="preserve"> 14 │         # min_samples_leaf=2 is the imbalanced-learn default for BRF and</w:t>
+              <w:br/>
+            </w:r>
+            <w:r>
+              <w:rPr>
+                <w:rFonts w:ascii="Menlo" w:hAnsi="Menlo"/>
+                <w:color w:val="222222"/>
+                <w:sz w:val="17"/>
+              </w:rPr>
+              <w:t xml:space="preserve"> 15 │         # leaves enough leaves to keep variable-importance ranks stable</w:t>
+              <w:br/>
+            </w:r>
+            <w:r>
+              <w:rPr>
+                <w:rFonts w:ascii="Menlo" w:hAnsi="Menlo"/>
+                <w:color w:val="222222"/>
+                <w:sz w:val="17"/>
+              </w:rPr>
+              <w:t xml:space="preserve"> 16 │         # (Spearman ρ = 0.98 across folds in 06_overfitting.py).</w:t>
+              <w:br/>
+            </w:r>
+            <w:r>
+              <w:rPr>
+                <w:rFonts w:ascii="Menlo" w:hAnsi="Menlo"/>
+                <w:color w:val="222222"/>
+                <w:sz w:val="17"/>
+              </w:rPr>
+              <w:t xml:space="preserve"> 17 │         n_estimators=300, min_samples_leaf=2,</w:t>
+              <w:br/>
+            </w:r>
+            <w:r>
+              <w:rPr>
+                <w:rFonts w:ascii="Menlo" w:hAnsi="Menlo"/>
+                <w:color w:val="222222"/>
+                <w:sz w:val="17"/>
+              </w:rPr>
+              <w:t xml:space="preserve"> 18 │         n_jobs=N_JOBS, random_state=SEED,</w:t>
+              <w:br/>
+            </w:r>
+            <w:r>
+              <w:rPr>
+                <w:rFonts w:ascii="Menlo" w:hAnsi="Menlo"/>
+                <w:color w:val="222222"/>
+                <w:sz w:val="17"/>
+              </w:rPr>
+              <w:t xml:space="preserve"> 19 │     )</w:t>
+              <w:br/>
+            </w:r>
+            <w:r>
+              <w:rPr>
+                <w:rFonts w:ascii="Menlo" w:hAnsi="Menlo"/>
+                <w:color w:val="222222"/>
+                <w:sz w:val="17"/>
+              </w:rPr>
+              <w:t xml:space="preserve"> 20 │     return Pipeline([("prep", prep), ("clf", clf)])</w:t>
             </w:r>
           </w:p>
         </w:tc>
@@ -2888,151 +2951,322 @@
                 <w:color w:val="222222"/>
                 <w:sz w:val="17"/>
               </w:rPr>
-              <w:t xml:space="preserve">  2 │     """Return mean OOF probability for each row across repeats."""</w:t>
-              <w:br/>
-            </w:r>
-            <w:r>
-              <w:rPr>
-                <w:rFonts w:ascii="Menlo" w:hAnsi="Menlo"/>
-                <w:color w:val="222222"/>
-                <w:sz w:val="17"/>
-              </w:rPr>
-              <w:t xml:space="preserve">  3 │     from sklearn.model_selection import RepeatedStratifiedKFold</w:t>
-              <w:br/>
-            </w:r>
-            <w:r>
-              <w:rPr>
-                <w:rFonts w:ascii="Menlo" w:hAnsi="Menlo"/>
-                <w:color w:val="222222"/>
-                <w:sz w:val="17"/>
-              </w:rPr>
-              <w:t xml:space="preserve">  4 │     from sklearn.base import clone</w:t>
-              <w:br/>
-            </w:r>
-            <w:r>
-              <w:rPr>
-                <w:rFonts w:ascii="Menlo" w:hAnsi="Menlo"/>
-                <w:color w:val="222222"/>
-                <w:sz w:val="17"/>
-              </w:rPr>
-              <w:t xml:space="preserve">  5 │     rskf = RepeatedStratifiedKFold(n_splits=n_splits, n_repeats=n_repeats, random_state=SEED)</w:t>
-              <w:br/>
-            </w:r>
-            <w:r>
-              <w:rPr>
-                <w:rFonts w:ascii="Menlo" w:hAnsi="Menlo"/>
-                <w:color w:val="222222"/>
-                <w:sz w:val="17"/>
-              </w:rPr>
-              <w:t xml:space="preserve">  6 │     p_acc = np.zeros(len(X))</w:t>
-              <w:br/>
-            </w:r>
-            <w:r>
-              <w:rPr>
-                <w:rFonts w:ascii="Menlo" w:hAnsi="Menlo"/>
-                <w:color w:val="222222"/>
-                <w:sz w:val="17"/>
-              </w:rPr>
-              <w:t xml:space="preserve">  7 │     n_acc = np.zeros(len(X))</w:t>
-              <w:br/>
-            </w:r>
-            <w:r>
-              <w:rPr>
-                <w:rFonts w:ascii="Menlo" w:hAnsi="Menlo"/>
-                <w:color w:val="222222"/>
-                <w:sz w:val="17"/>
-              </w:rPr>
-              <w:t xml:space="preserve">  8 │     for split_idx, (tr, te) in enumerate(rskf.split(X, y)):</w:t>
-              <w:br/>
-            </w:r>
-            <w:r>
-              <w:rPr>
-                <w:rFonts w:ascii="Menlo" w:hAnsi="Menlo"/>
-                <w:color w:val="222222"/>
-                <w:sz w:val="17"/>
-              </w:rPr>
-              <w:t xml:space="preserve">  9 │         pipe = make_pipe_fn()</w:t>
-              <w:br/>
-            </w:r>
-            <w:r>
-              <w:rPr>
-                <w:rFonts w:ascii="Menlo" w:hAnsi="Menlo"/>
-                <w:color w:val="222222"/>
-                <w:sz w:val="17"/>
-              </w:rPr>
-              <w:t xml:space="preserve"> 10 │         pipe.fit(X.iloc[tr], y.iloc[tr])</w:t>
-              <w:br/>
-            </w:r>
-            <w:r>
-              <w:rPr>
-                <w:rFonts w:ascii="Menlo" w:hAnsi="Menlo"/>
-                <w:color w:val="222222"/>
-                <w:sz w:val="17"/>
-              </w:rPr>
-              <w:t xml:space="preserve"> 11 │         p = pipe.predict_proba(X.iloc[te])[:, 1]</w:t>
-              <w:br/>
-            </w:r>
-            <w:r>
-              <w:rPr>
-                <w:rFonts w:ascii="Menlo" w:hAnsi="Menlo"/>
-                <w:color w:val="222222"/>
-                <w:sz w:val="17"/>
-              </w:rPr>
-              <w:t xml:space="preserve"> 12 │         p_acc[te] += p</w:t>
-              <w:br/>
-            </w:r>
-            <w:r>
-              <w:rPr>
-                <w:rFonts w:ascii="Menlo" w:hAnsi="Menlo"/>
-                <w:color w:val="222222"/>
-                <w:sz w:val="17"/>
-              </w:rPr>
-              <w:t xml:space="preserve"> 13 │         n_acc[te] += 1</w:t>
-              <w:br/>
-            </w:r>
-            <w:r>
-              <w:rPr>
-                <w:rFonts w:ascii="Menlo" w:hAnsi="Menlo"/>
-                <w:color w:val="222222"/>
-                <w:sz w:val="17"/>
-              </w:rPr>
-              <w:t xml:space="preserve"> 14 │     return p_acc / np.maximum(n_acc, 1)</w:t>
-              <w:br/>
-            </w:r>
-            <w:r>
-              <w:rPr>
-                <w:rFonts w:ascii="Menlo" w:hAnsi="Menlo"/>
-                <w:color w:val="222222"/>
-                <w:sz w:val="17"/>
-              </w:rPr>
-              <w:t xml:space="preserve"> 15 │ </w:t>
-              <w:br/>
-            </w:r>
-            <w:r>
-              <w:rPr>
-                <w:rFonts w:ascii="Menlo" w:hAnsi="Menlo"/>
-                <w:color w:val="222222"/>
-                <w:sz w:val="17"/>
-              </w:rPr>
-              <w:t xml:space="preserve"> 16 │ # ──────────────────────────────────────────────────────────────────────────</w:t>
-              <w:br/>
-            </w:r>
-            <w:r>
-              <w:rPr>
-                <w:rFonts w:ascii="Menlo" w:hAnsi="Menlo"/>
-                <w:color w:val="222222"/>
-                <w:sz w:val="17"/>
-              </w:rPr>
-              <w:t xml:space="preserve"> 17 │ # Calibration metrics</w:t>
-              <w:br/>
-            </w:r>
-            <w:r>
-              <w:rPr>
-                <w:rFonts w:ascii="Menlo" w:hAnsi="Menlo"/>
-                <w:color w:val="222222"/>
-                <w:sz w:val="17"/>
-              </w:rPr>
-              <w:t xml:space="preserve"> 18 │ # ──────────────────────────────────────────────────────────────────────────</w:t>
+              <w:t xml:space="preserve">  2 │     """Return mean out-of-fold probability for each row across repeated</w:t>
+              <w:br/>
+            </w:r>
+            <w:r>
+              <w:rPr>
+                <w:rFonts w:ascii="Menlo" w:hAnsi="Menlo"/>
+                <w:color w:val="222222"/>
+                <w:sz w:val="17"/>
+              </w:rPr>
+              <w:t xml:space="preserve">  3 │     stratified K-fold cross-validation.</w:t>
+              <w:br/>
+            </w:r>
+            <w:r>
+              <w:rPr>
+                <w:rFonts w:ascii="Menlo" w:hAnsi="Menlo"/>
+                <w:color w:val="222222"/>
+                <w:sz w:val="17"/>
+              </w:rPr>
+              <w:t xml:space="preserve">  4 │ </w:t>
+              <w:br/>
+            </w:r>
+            <w:r>
+              <w:rPr>
+                <w:rFonts w:ascii="Menlo" w:hAnsi="Menlo"/>
+                <w:color w:val="222222"/>
+                <w:sz w:val="17"/>
+              </w:rPr>
+              <w:t xml:space="preserve">  5 │     Parameters</w:t>
+              <w:br/>
+            </w:r>
+            <w:r>
+              <w:rPr>
+                <w:rFonts w:ascii="Menlo" w:hAnsi="Menlo"/>
+                <w:color w:val="222222"/>
+                <w:sz w:val="17"/>
+              </w:rPr>
+              <w:t xml:space="preserve">  6 │     ----------</w:t>
+              <w:br/>
+            </w:r>
+            <w:r>
+              <w:rPr>
+                <w:rFonts w:ascii="Menlo" w:hAnsi="Menlo"/>
+                <w:color w:val="222222"/>
+                <w:sz w:val="17"/>
+              </w:rPr>
+              <w:t xml:space="preserve">  7 │     make_pipe_fn : Callable returning a fresh sklearn Pipeline.</w:t>
+              <w:br/>
+            </w:r>
+            <w:r>
+              <w:rPr>
+                <w:rFonts w:ascii="Menlo" w:hAnsi="Menlo"/>
+                <w:color w:val="222222"/>
+                <w:sz w:val="17"/>
+              </w:rPr>
+              <w:t xml:space="preserve">  8 │     X : pd.DataFrame  — feature matrix.</w:t>
+              <w:br/>
+            </w:r>
+            <w:r>
+              <w:rPr>
+                <w:rFonts w:ascii="Menlo" w:hAnsi="Menlo"/>
+                <w:color w:val="222222"/>
+                <w:sz w:val="17"/>
+              </w:rPr>
+              <w:t xml:space="preserve">  9 │     y : pd.Series     — binary outcome.</w:t>
+              <w:br/>
+            </w:r>
+            <w:r>
+              <w:rPr>
+                <w:rFonts w:ascii="Menlo" w:hAnsi="Menlo"/>
+                <w:color w:val="222222"/>
+                <w:sz w:val="17"/>
+              </w:rPr>
+              <w:t xml:space="preserve"> 10 │     n_splits : int    — number of folds per repeat (default 5).</w:t>
+              <w:br/>
+            </w:r>
+            <w:r>
+              <w:rPr>
+                <w:rFonts w:ascii="Menlo" w:hAnsi="Menlo"/>
+                <w:color w:val="222222"/>
+                <w:sz w:val="17"/>
+              </w:rPr>
+              <w:t xml:space="preserve"> 11 │     n_repeats : int   — number of repeated draws of the K-fold split (default 5).</w:t>
+              <w:br/>
+            </w:r>
+            <w:r>
+              <w:rPr>
+                <w:rFonts w:ascii="Menlo" w:hAnsi="Menlo"/>
+                <w:color w:val="222222"/>
+                <w:sz w:val="17"/>
+              </w:rPr>
+              <w:t xml:space="preserve"> 12 │     groups : unused, kept for backward-compatible signature.</w:t>
+              <w:br/>
+            </w:r>
+            <w:r>
+              <w:rPr>
+                <w:rFonts w:ascii="Menlo" w:hAnsi="Menlo"/>
+                <w:color w:val="222222"/>
+                <w:sz w:val="17"/>
+              </w:rPr>
+              <w:t xml:space="preserve"> 13 │ </w:t>
+              <w:br/>
+            </w:r>
+            <w:r>
+              <w:rPr>
+                <w:rFonts w:ascii="Menlo" w:hAnsi="Menlo"/>
+                <w:color w:val="222222"/>
+                <w:sz w:val="17"/>
+              </w:rPr>
+              <w:t xml:space="preserve"> 14 │     Returns</w:t>
+              <w:br/>
+            </w:r>
+            <w:r>
+              <w:rPr>
+                <w:rFonts w:ascii="Menlo" w:hAnsi="Menlo"/>
+                <w:color w:val="222222"/>
+                <w:sz w:val="17"/>
+              </w:rPr>
+              <w:t xml:space="preserve"> 15 │     -------</w:t>
+              <w:br/>
+            </w:r>
+            <w:r>
+              <w:rPr>
+                <w:rFonts w:ascii="Menlo" w:hAnsi="Menlo"/>
+                <w:color w:val="222222"/>
+                <w:sz w:val="17"/>
+              </w:rPr>
+              <w:t xml:space="preserve"> 16 │     np.ndarray of length len(X) with the average OOF probability per row.</w:t>
+              <w:br/>
+            </w:r>
+            <w:r>
+              <w:rPr>
+                <w:rFonts w:ascii="Menlo" w:hAnsi="Menlo"/>
+                <w:color w:val="222222"/>
+                <w:sz w:val="17"/>
+              </w:rPr>
+              <w:t xml:space="preserve"> 17 │     """</w:t>
+              <w:br/>
+            </w:r>
+            <w:r>
+              <w:rPr>
+                <w:rFonts w:ascii="Menlo" w:hAnsi="Menlo"/>
+                <w:color w:val="222222"/>
+                <w:sz w:val="17"/>
+              </w:rPr>
+              <w:t xml:space="preserve"> 18 │     from sklearn.model_selection import RepeatedStratifiedKFold</w:t>
+              <w:br/>
+            </w:r>
+            <w:r>
+              <w:rPr>
+                <w:rFonts w:ascii="Menlo" w:hAnsi="Menlo"/>
+                <w:color w:val="222222"/>
+                <w:sz w:val="17"/>
+              </w:rPr>
+              <w:t xml:space="preserve"> 19 │     rskf = RepeatedStratifiedKFold(n_splits=n_splits, n_repeats=n_repeats,</w:t>
+              <w:br/>
+            </w:r>
+            <w:r>
+              <w:rPr>
+                <w:rFonts w:ascii="Menlo" w:hAnsi="Menlo"/>
+                <w:color w:val="222222"/>
+                <w:sz w:val="17"/>
+              </w:rPr>
+              <w:t xml:space="preserve"> 20 │                                      random_state=SEED)</w:t>
+              <w:br/>
+            </w:r>
+            <w:r>
+              <w:rPr>
+                <w:rFonts w:ascii="Menlo" w:hAnsi="Menlo"/>
+                <w:color w:val="222222"/>
+                <w:sz w:val="17"/>
+              </w:rPr>
+              <w:t xml:space="preserve"> 21 │     p_acc = np.zeros(len(X))</w:t>
+              <w:br/>
+            </w:r>
+            <w:r>
+              <w:rPr>
+                <w:rFonts w:ascii="Menlo" w:hAnsi="Menlo"/>
+                <w:color w:val="222222"/>
+                <w:sz w:val="17"/>
+              </w:rPr>
+              <w:t xml:space="preserve"> 22 │     n_acc = np.zeros(len(X))</w:t>
+              <w:br/>
+            </w:r>
+            <w:r>
+              <w:rPr>
+                <w:rFonts w:ascii="Menlo" w:hAnsi="Menlo"/>
+                <w:color w:val="222222"/>
+                <w:sz w:val="17"/>
+              </w:rPr>
+              <w:t xml:space="preserve"> 23 │     for tr, te in rskf.split(X, y):</w:t>
+              <w:br/>
+            </w:r>
+            <w:r>
+              <w:rPr>
+                <w:rFonts w:ascii="Menlo" w:hAnsi="Menlo"/>
+                <w:color w:val="222222"/>
+                <w:sz w:val="17"/>
+              </w:rPr>
+              <w:t xml:space="preserve"> 24 │         pipe = make_pipe_fn()</w:t>
+              <w:br/>
+            </w:r>
+            <w:r>
+              <w:rPr>
+                <w:rFonts w:ascii="Menlo" w:hAnsi="Menlo"/>
+                <w:color w:val="222222"/>
+                <w:sz w:val="17"/>
+              </w:rPr>
+              <w:t xml:space="preserve"> 25 │         pipe.fit(X.iloc[tr], y.iloc[tr])</w:t>
+              <w:br/>
+            </w:r>
+            <w:r>
+              <w:rPr>
+                <w:rFonts w:ascii="Menlo" w:hAnsi="Menlo"/>
+                <w:color w:val="222222"/>
+                <w:sz w:val="17"/>
+              </w:rPr>
+              <w:t xml:space="preserve"> 26 │         p_acc[te] += pipe.predict_proba(X.iloc[te])[:, 1]</w:t>
+              <w:br/>
+            </w:r>
+            <w:r>
+              <w:rPr>
+                <w:rFonts w:ascii="Menlo" w:hAnsi="Menlo"/>
+                <w:color w:val="222222"/>
+                <w:sz w:val="17"/>
+              </w:rPr>
+              <w:t xml:space="preserve"> 27 │         n_acc[te] += 1</w:t>
+              <w:br/>
+            </w:r>
+            <w:r>
+              <w:rPr>
+                <w:rFonts w:ascii="Menlo" w:hAnsi="Menlo"/>
+                <w:color w:val="222222"/>
+                <w:sz w:val="17"/>
+              </w:rPr>
+              <w:t xml:space="preserve"> 28 │     return p_acc / np.maximum(n_acc, 1)</w:t>
+              <w:br/>
+            </w:r>
+            <w:r>
+              <w:rPr>
+                <w:rFonts w:ascii="Menlo" w:hAnsi="Menlo"/>
+                <w:color w:val="222222"/>
+                <w:sz w:val="17"/>
+              </w:rPr>
+              <w:t xml:space="preserve"> 29 │ </w:t>
+              <w:br/>
+            </w:r>
+            <w:r>
+              <w:rPr>
+                <w:rFonts w:ascii="Menlo" w:hAnsi="Menlo"/>
+                <w:color w:val="222222"/>
+                <w:sz w:val="17"/>
+              </w:rPr>
+              <w:t xml:space="preserve"> 30 │ # ──────────────────────────────────────────────────────────────────────────</w:t>
+              <w:br/>
+            </w:r>
+            <w:r>
+              <w:rPr>
+                <w:rFonts w:ascii="Menlo" w:hAnsi="Menlo"/>
+                <w:color w:val="222222"/>
+                <w:sz w:val="17"/>
+              </w:rPr>
+              <w:t xml:space="preserve"> 31 │ # Consolidated evaluation helpers (CODE_REVIEW item C1)</w:t>
+              <w:br/>
+            </w:r>
+            <w:r>
+              <w:rPr>
+                <w:rFonts w:ascii="Menlo" w:hAnsi="Menlo"/>
+                <w:color w:val="222222"/>
+                <w:sz w:val="17"/>
+              </w:rPr>
+              <w:t xml:space="preserve"> 32 │ #</w:t>
+              <w:br/>
+            </w:r>
+            <w:r>
+              <w:rPr>
+                <w:rFonts w:ascii="Menlo" w:hAnsi="Menlo"/>
+                <w:color w:val="222222"/>
+                <w:sz w:val="17"/>
+              </w:rPr>
+              <w:t xml:space="preserve"> 33 │ # The bootstrap-AUC, paired DeLong test, and CV-AUC helpers were previously</w:t>
+              <w:br/>
+            </w:r>
+            <w:r>
+              <w:rPr>
+                <w:rFonts w:ascii="Menlo" w:hAnsi="Menlo"/>
+                <w:color w:val="222222"/>
+                <w:sz w:val="17"/>
+              </w:rPr>
+              <w:t xml:space="preserve"> 34 │ # duplicated across scripts 18, 19, 21, 22, 23, 24, 25.  Defining them once</w:t>
+              <w:br/>
+            </w:r>
+            <w:r>
+              <w:rPr>
+                <w:rFonts w:ascii="Menlo" w:hAnsi="Menlo"/>
+                <w:color w:val="222222"/>
+                <w:sz w:val="17"/>
+              </w:rPr>
+              <w:t xml:space="preserve"> 35 │ # here removes ~120 LOC of duplication and prevents subtle divergence (e.g.</w:t>
+              <w:br/>
+            </w:r>
+            <w:r>
+              <w:rPr>
+                <w:rFonts w:ascii="Menlo" w:hAnsi="Menlo"/>
+                <w:color w:val="222222"/>
+                <w:sz w:val="17"/>
+              </w:rPr>
+              <w:t xml:space="preserve"> 36 │ # different bootstrap seeds) during future refactoring.</w:t>
+              <w:br/>
+            </w:r>
+            <w:r>
+              <w:rPr>
+                <w:rFonts w:ascii="Menlo" w:hAnsi="Menlo"/>
+                <w:color w:val="222222"/>
+                <w:sz w:val="17"/>
+              </w:rPr>
+              <w:t xml:space="preserve"> 37 │ # ──────────────────────────────────────────────────────────────────────────</w:t>
             </w:r>
           </w:p>
         </w:tc>
@@ -9091,7 +9325,7 @@
           <w:i w:val="0"/>
           <w:sz w:val="22"/>
         </w:rPr>
-        <w:t>The headline finding produced by this script is that Firth matches the published BalancedRandomForest baseline on AUC (0.681 vs 0.676; DeLong p = 0.81) with a 3.3-fold improvement in Brier score. The Bayesian-with-eICU-priors variant, by contrast, degrades discrimination significantly — a finding that the manuscript interprets as a biological-mismatch warning, not a statistical failure.</w:t>
+        <w:t>The headline finding produced by this script is that Firth matches the BalancedRandomForest baseline on AUC (0.681 vs 0.676; DeLong p = 0.81) with a 3.3-fold improvement in Brier score. The Bayesian-with-eICU-priors variant, by contrast, degrades discrimination significantly — a finding that the manuscript interprets as a biological-mismatch warning, not a statistical failure.</w:t>
       </w:r>
     </w:p>
     <w:p>
@@ -9755,844 +9989,844 @@
                 <w:color w:val="222222"/>
                 <w:sz w:val="17"/>
               </w:rPr>
-              <w:t xml:space="preserve"> 68 │     """Mondrian conformal: separate calibration per class.</w:t>
-              <w:br/>
-            </w:r>
-            <w:r>
-              <w:rPr>
-                <w:rFonts w:ascii="Menlo" w:hAnsi="Menlo"/>
-                <w:color w:val="222222"/>
-                <w:sz w:val="17"/>
-              </w:rPr>
-              <w:t xml:space="preserve"> 69 │     Returns prediction-set membership: shape (n_test, 2) booleans.</w:t>
-              <w:br/>
-            </w:r>
-            <w:r>
-              <w:rPr>
-                <w:rFonts w:ascii="Menlo" w:hAnsi="Menlo"/>
-                <w:color w:val="222222"/>
-                <w:sz w:val="17"/>
-              </w:rPr>
-              <w:t xml:space="preserve"> 70 │     For each class c, q_c = (1-α) empirical quantile of (1 - p_c) on calibration</w:t>
-              <w:br/>
-            </w:r>
-            <w:r>
-              <w:rPr>
-                <w:rFonts w:ascii="Menlo" w:hAnsi="Menlo"/>
-                <w:color w:val="222222"/>
-                <w:sz w:val="17"/>
-              </w:rPr>
-              <w:t xml:space="preserve"> 71 │     examples of class c. Prediction set includes y if (1 - p_y) ≤ q_y.</w:t>
-              <w:br/>
-            </w:r>
-            <w:r>
-              <w:rPr>
-                <w:rFonts w:ascii="Menlo" w:hAnsi="Menlo"/>
-                <w:color w:val="222222"/>
-                <w:sz w:val="17"/>
-              </w:rPr>
-              <w:t xml:space="preserve"> 72 │     """</w:t>
-              <w:br/>
-            </w:r>
-            <w:r>
-              <w:rPr>
-                <w:rFonts w:ascii="Menlo" w:hAnsi="Menlo"/>
-                <w:color w:val="222222"/>
-                <w:sz w:val="17"/>
-              </w:rPr>
-              <w:t xml:space="preserve"> 73 │     p_cal = np.clip(p_cal, 1e-6, 1 - 1e-6)</w:t>
-              <w:br/>
-            </w:r>
-            <w:r>
-              <w:rPr>
-                <w:rFonts w:ascii="Menlo" w:hAnsi="Menlo"/>
-                <w:color w:val="222222"/>
-                <w:sz w:val="17"/>
-              </w:rPr>
-              <w:t xml:space="preserve"> 74 │     p_test = np.clip(p_test, 1e-6, 1 - 1e-6)</w:t>
-              <w:br/>
-            </w:r>
-            <w:r>
-              <w:rPr>
-                <w:rFonts w:ascii="Menlo" w:hAnsi="Menlo"/>
-                <w:color w:val="222222"/>
-                <w:sz w:val="17"/>
-              </w:rPr>
-              <w:t xml:space="preserve"> 75 │     # nonconformity = 1 - P(true class) on calibration set</w:t>
-              <w:br/>
-            </w:r>
-            <w:r>
-              <w:rPr>
-                <w:rFonts w:ascii="Menlo" w:hAnsi="Menlo"/>
-                <w:color w:val="222222"/>
-                <w:sz w:val="17"/>
-              </w:rPr>
-              <w:t xml:space="preserve"> 76 │     nc_pos = 1.0 - p_cal[y_cal == 1]      # cases where true=1</w:t>
-              <w:br/>
-            </w:r>
-            <w:r>
-              <w:rPr>
-                <w:rFonts w:ascii="Menlo" w:hAnsi="Menlo"/>
-                <w:color w:val="222222"/>
-                <w:sz w:val="17"/>
-              </w:rPr>
-              <w:t xml:space="preserve"> 77 │     nc_neg = 1.0 - (1.0 - p_cal[y_cal == 0])  # cases where true=0 → 1-P(y=0)</w:t>
-              <w:br/>
-            </w:r>
-            <w:r>
-              <w:rPr>
-                <w:rFonts w:ascii="Menlo" w:hAnsi="Menlo"/>
-                <w:color w:val="222222"/>
-                <w:sz w:val="17"/>
-              </w:rPr>
-              <w:t xml:space="preserve"> 78 │     if len(nc_pos) &lt; 2 or len(nc_neg) &lt; 2:</w:t>
-              <w:br/>
-            </w:r>
-            <w:r>
-              <w:rPr>
-                <w:rFonts w:ascii="Menlo" w:hAnsi="Menlo"/>
-                <w:color w:val="222222"/>
-                <w:sz w:val="17"/>
-              </w:rPr>
-              <w:t xml:space="preserve"> 79 │         return np.zeros((len(p_test), 2), dtype=bool)</w:t>
-              <w:br/>
-            </w:r>
-            <w:r>
-              <w:rPr>
-                <w:rFonts w:ascii="Menlo" w:hAnsi="Menlo"/>
-                <w:color w:val="222222"/>
-                <w:sz w:val="17"/>
-              </w:rPr>
-              <w:t xml:space="preserve"> 80 │     # finite-sample correction: (n+1)(1-α)/n th value</w:t>
-              <w:br/>
-            </w:r>
-            <w:r>
-              <w:rPr>
-                <w:rFonts w:ascii="Menlo" w:hAnsi="Menlo"/>
-                <w:color w:val="222222"/>
-                <w:sz w:val="17"/>
-              </w:rPr>
-              <w:t xml:space="preserve"> 81 │     n_pos = len(nc_pos); n_neg = len(nc_neg)</w:t>
-              <w:br/>
-            </w:r>
-            <w:r>
-              <w:rPr>
-                <w:rFonts w:ascii="Menlo" w:hAnsi="Menlo"/>
-                <w:color w:val="222222"/>
-                <w:sz w:val="17"/>
-              </w:rPr>
-              <w:t xml:space="preserve"> 82 │     q_pos = np.quantile(nc_pos, min(1.0, (1 - alpha) * (n_pos + 1) / n_pos))</w:t>
-              <w:br/>
-            </w:r>
-            <w:r>
-              <w:rPr>
-                <w:rFonts w:ascii="Menlo" w:hAnsi="Menlo"/>
-                <w:color w:val="222222"/>
-                <w:sz w:val="17"/>
-              </w:rPr>
-              <w:t xml:space="preserve"> 83 │     q_neg = np.quantile(nc_neg, min(1.0, (1 - alpha) * (n_neg + 1) / n_neg))</w:t>
-              <w:br/>
-            </w:r>
-            <w:r>
-              <w:rPr>
-                <w:rFonts w:ascii="Menlo" w:hAnsi="Menlo"/>
-                <w:color w:val="222222"/>
-                <w:sz w:val="17"/>
-              </w:rPr>
-              <w:t xml:space="preserve"> 84 │     # for each test point, include class c if its nonconformity ≤ q_c</w:t>
-              <w:br/>
-            </w:r>
-            <w:r>
-              <w:rPr>
-                <w:rFonts w:ascii="Menlo" w:hAnsi="Menlo"/>
-                <w:color w:val="222222"/>
-                <w:sz w:val="17"/>
-              </w:rPr>
-              <w:t xml:space="preserve"> 85 │     include_pos = (1.0 - p_test)         &lt;= q_pos       # include "1" if (1-P(1)) ≤ q_pos</w:t>
-              <w:br/>
-            </w:r>
-            <w:r>
-              <w:rPr>
-                <w:rFonts w:ascii="Menlo" w:hAnsi="Menlo"/>
-                <w:color w:val="222222"/>
-                <w:sz w:val="17"/>
-              </w:rPr>
-              <w:t xml:space="preserve"> 86 │     include_neg = (1.0 - (1.0 - p_test)) &lt;= q_neg       # include "0" if (1-P(0)) ≤ q_neg</w:t>
-              <w:br/>
-            </w:r>
-            <w:r>
-              <w:rPr>
-                <w:rFonts w:ascii="Menlo" w:hAnsi="Menlo"/>
-                <w:color w:val="222222"/>
-                <w:sz w:val="17"/>
-              </w:rPr>
-              <w:t xml:space="preserve"> 87 │     return np.column_stack([include_neg, include_pos]).astype(bool)</w:t>
-              <w:br/>
-            </w:r>
-            <w:r>
-              <w:rPr>
-                <w:rFonts w:ascii="Menlo" w:hAnsi="Menlo"/>
-                <w:color w:val="222222"/>
-                <w:sz w:val="17"/>
-              </w:rPr>
-              <w:t xml:space="preserve"> 88 │ </w:t>
-              <w:br/>
-            </w:r>
-            <w:r>
-              <w:rPr>
-                <w:rFonts w:ascii="Menlo" w:hAnsi="Menlo"/>
-                <w:color w:val="222222"/>
-                <w:sz w:val="17"/>
-              </w:rPr>
-              <w:t xml:space="preserve"> 89 │ </w:t>
-              <w:br/>
-            </w:r>
-            <w:r>
-              <w:rPr>
-                <w:rFonts w:ascii="Menlo" w:hAnsi="Menlo"/>
-                <w:color w:val="222222"/>
-                <w:sz w:val="17"/>
-              </w:rPr>
-              <w:t xml:space="preserve"> 90 │ def evaluate_conformal(make_pipe_fn, features, X, y, alphas=ALPHAS,</w:t>
-              <w:br/>
-            </w:r>
-            <w:r>
-              <w:rPr>
-                <w:rFonts w:ascii="Menlo" w:hAnsi="Menlo"/>
-                <w:color w:val="222222"/>
-                <w:sz w:val="17"/>
-              </w:rPr>
-              <w:t xml:space="preserve"> 91 │                         n_splits=N_SPLITS, n_repeats=N_REPEATS):</w:t>
-              <w:br/>
-            </w:r>
-            <w:r>
-              <w:rPr>
-                <w:rFonts w:ascii="Menlo" w:hAnsi="Menlo"/>
-                <w:color w:val="222222"/>
-                <w:sz w:val="17"/>
-              </w:rPr>
-              <w:t xml:space="preserve"> 92 │     """Cross-conformal: split → fit on train, calibrate on val, predict on test.</w:t>
-              <w:br/>
-            </w:r>
-            <w:r>
-              <w:rPr>
-                <w:rFonts w:ascii="Menlo" w:hAnsi="Menlo"/>
-                <w:color w:val="222222"/>
-                <w:sz w:val="17"/>
-              </w:rPr>
-              <w:t xml:space="preserve"> 93 │     We use a 3-way split per fold: train (60%), calibration (20%), test (20%).</w:t>
-              <w:br/>
-            </w:r>
-            <w:r>
-              <w:rPr>
-                <w:rFonts w:ascii="Menlo" w:hAnsi="Menlo"/>
-                <w:color w:val="222222"/>
-                <w:sz w:val="17"/>
-              </w:rPr>
-              <w:t xml:space="preserve"> 94 │     Aggregate metrics over repeated CV.</w:t>
-              <w:br/>
-            </w:r>
-            <w:r>
-              <w:rPr>
-                <w:rFonts w:ascii="Menlo" w:hAnsi="Menlo"/>
-                <w:color w:val="222222"/>
-                <w:sz w:val="17"/>
-              </w:rPr>
-              <w:t xml:space="preserve"> 95 │     """</w:t>
-              <w:br/>
-            </w:r>
-            <w:r>
-              <w:rPr>
-                <w:rFonts w:ascii="Menlo" w:hAnsi="Menlo"/>
-                <w:color w:val="222222"/>
-                <w:sz w:val="17"/>
-              </w:rPr>
-              <w:t xml:space="preserve"> 96 │     metrics = {a: {"coverage": [], "set_size": [], "singleton_rate": [],</w:t>
-              <w:br/>
-            </w:r>
-            <w:r>
-              <w:rPr>
-                <w:rFonts w:ascii="Menlo" w:hAnsi="Menlo"/>
-                <w:color w:val="222222"/>
-                <w:sz w:val="17"/>
-              </w:rPr>
-              <w:t xml:space="preserve"> 97 │                     "rule_out_rate": [], "rule_in_rate": []} for a in alphas}</w:t>
-              <w:br/>
-            </w:r>
-            <w:r>
-              <w:rPr>
-                <w:rFonts w:ascii="Menlo" w:hAnsi="Menlo"/>
-                <w:color w:val="222222"/>
-                <w:sz w:val="17"/>
-              </w:rPr>
-              <w:t xml:space="preserve"> 98 │     rng = np.random.default_rng(SEED)</w:t>
-              <w:br/>
-            </w:r>
-            <w:r>
-              <w:rPr>
-                <w:rFonts w:ascii="Menlo" w:hAnsi="Menlo"/>
-                <w:color w:val="222222"/>
-                <w:sz w:val="17"/>
-              </w:rPr>
-              <w:t xml:space="preserve"> 99 │     for rep in range(n_repeats):</w:t>
-              <w:br/>
-            </w:r>
-            <w:r>
-              <w:rPr>
-                <w:rFonts w:ascii="Menlo" w:hAnsi="Menlo"/>
-                <w:color w:val="222222"/>
-                <w:sz w:val="17"/>
-              </w:rPr>
-              <w:t>100 │         skf = StratifiedKFold(n_splits=n_splits, shuffle=True,</w:t>
-              <w:br/>
-            </w:r>
-            <w:r>
-              <w:rPr>
-                <w:rFonts w:ascii="Menlo" w:hAnsi="Menlo"/>
-                <w:color w:val="222222"/>
-                <w:sz w:val="17"/>
-              </w:rPr>
-              <w:t>101 │                                 random_state=SEED + rep)</w:t>
-              <w:br/>
-            </w:r>
-            <w:r>
-              <w:rPr>
-                <w:rFonts w:ascii="Menlo" w:hAnsi="Menlo"/>
-                <w:color w:val="222222"/>
-                <w:sz w:val="17"/>
-              </w:rPr>
-              <w:t>102 │         for fold_idx, (trainval, test) in enumerate(skf.split(X, y)):</w:t>
-              <w:br/>
-            </w:r>
-            <w:r>
-              <w:rPr>
-                <w:rFonts w:ascii="Menlo" w:hAnsi="Menlo"/>
-                <w:color w:val="222222"/>
-                <w:sz w:val="17"/>
-              </w:rPr>
-              <w:t>103 │             # Split trainval → train (75%) + cal (25%)</w:t>
-              <w:br/>
-            </w:r>
-            <w:r>
-              <w:rPr>
-                <w:rFonts w:ascii="Menlo" w:hAnsi="Menlo"/>
-                <w:color w:val="222222"/>
-                <w:sz w:val="17"/>
-              </w:rPr>
-              <w:t>104 │             yv = y.iloc[trainval]</w:t>
-              <w:br/>
-            </w:r>
-            <w:r>
-              <w:rPr>
-                <w:rFonts w:ascii="Menlo" w:hAnsi="Menlo"/>
-                <w:color w:val="222222"/>
-                <w:sz w:val="17"/>
-              </w:rPr>
-              <w:t>105 │             pos_v = np.where(yv == 1)[0]; neg_v = np.where(yv == 0)[0]</w:t>
-              <w:br/>
-            </w:r>
-            <w:r>
-              <w:rPr>
-                <w:rFonts w:ascii="Menlo" w:hAnsi="Menlo"/>
-                <w:color w:val="222222"/>
-                <w:sz w:val="17"/>
-              </w:rPr>
-              <w:t>106 │             rng_l = np.random.default_rng(SEED + rep * 100 + fold_idx)</w:t>
-              <w:br/>
-            </w:r>
-            <w:r>
-              <w:rPr>
-                <w:rFonts w:ascii="Menlo" w:hAnsi="Menlo"/>
-                <w:color w:val="222222"/>
-                <w:sz w:val="17"/>
-              </w:rPr>
-              <w:t>107 │             rng_l.shuffle(pos_v); rng_l.shuffle(neg_v)</w:t>
-              <w:br/>
-            </w:r>
-            <w:r>
-              <w:rPr>
-                <w:rFonts w:ascii="Menlo" w:hAnsi="Menlo"/>
-                <w:color w:val="222222"/>
-                <w:sz w:val="17"/>
-              </w:rPr>
-              <w:t>108 │             cal_pos = pos_v[: max(2, len(pos_v) // 4)]</w:t>
-              <w:br/>
-            </w:r>
-            <w:r>
-              <w:rPr>
-                <w:rFonts w:ascii="Menlo" w:hAnsi="Menlo"/>
-                <w:color w:val="222222"/>
-                <w:sz w:val="17"/>
-              </w:rPr>
-              <w:t>109 │             cal_neg = neg_v[: max(2, len(neg_v) // 4)]</w:t>
-              <w:br/>
-            </w:r>
-            <w:r>
-              <w:rPr>
-                <w:rFonts w:ascii="Menlo" w:hAnsi="Menlo"/>
-                <w:color w:val="222222"/>
-                <w:sz w:val="17"/>
-              </w:rPr>
-              <w:t>110 │             cal_idx = trainval[np.concatenate([cal_pos, cal_neg])]</w:t>
-              <w:br/>
-            </w:r>
-            <w:r>
-              <w:rPr>
-                <w:rFonts w:ascii="Menlo" w:hAnsi="Menlo"/>
-                <w:color w:val="222222"/>
-                <w:sz w:val="17"/>
-              </w:rPr>
-              <w:t>111 │             train_idx = np.setdiff1d(trainval, cal_idx)</w:t>
-              <w:br/>
-            </w:r>
-            <w:r>
-              <w:rPr>
-                <w:rFonts w:ascii="Menlo" w:hAnsi="Menlo"/>
-                <w:color w:val="222222"/>
-                <w:sz w:val="17"/>
-              </w:rPr>
-              <w:t>112 │             X_tr, y_tr = X.iloc[train_idx], y.iloc[train_idx]</w:t>
-              <w:br/>
-            </w:r>
-            <w:r>
-              <w:rPr>
-                <w:rFonts w:ascii="Menlo" w:hAnsi="Menlo"/>
-                <w:color w:val="222222"/>
-                <w:sz w:val="17"/>
-              </w:rPr>
-              <w:t>113 │             X_cal, y_cal = X.iloc[cal_idx], y.iloc[cal_idx]</w:t>
-              <w:br/>
-            </w:r>
-            <w:r>
-              <w:rPr>
-                <w:rFonts w:ascii="Menlo" w:hAnsi="Menlo"/>
-                <w:color w:val="222222"/>
-                <w:sz w:val="17"/>
-              </w:rPr>
-              <w:t>114 │             X_te, y_te = X.iloc[test], y.iloc[test]</w:t>
-              <w:br/>
-            </w:r>
-            <w:r>
-              <w:rPr>
-                <w:rFonts w:ascii="Menlo" w:hAnsi="Menlo"/>
-                <w:color w:val="222222"/>
-                <w:sz w:val="17"/>
-              </w:rPr>
-              <w:t>115 │             if y_tr.sum() &lt; 5 or y_cal.sum() &lt; 2: continue</w:t>
-              <w:br/>
-            </w:r>
-            <w:r>
-              <w:rPr>
-                <w:rFonts w:ascii="Menlo" w:hAnsi="Menlo"/>
-                <w:color w:val="222222"/>
-                <w:sz w:val="17"/>
-              </w:rPr>
-              <w:t xml:space="preserve">116 │ </w:t>
-              <w:br/>
-            </w:r>
-            <w:r>
-              <w:rPr>
-                <w:rFonts w:ascii="Menlo" w:hAnsi="Menlo"/>
-                <w:color w:val="222222"/>
-                <w:sz w:val="17"/>
-              </w:rPr>
-              <w:t>117 │             try:</w:t>
-              <w:br/>
-            </w:r>
-            <w:r>
-              <w:rPr>
-                <w:rFonts w:ascii="Menlo" w:hAnsi="Menlo"/>
-                <w:color w:val="222222"/>
-                <w:sz w:val="17"/>
-              </w:rPr>
-              <w:t>118 │                 pipe = make_pipe_fn()</w:t>
-              <w:br/>
-            </w:r>
-            <w:r>
-              <w:rPr>
-                <w:rFonts w:ascii="Menlo" w:hAnsi="Menlo"/>
-                <w:color w:val="222222"/>
-                <w:sz w:val="17"/>
-              </w:rPr>
-              <w:t>119 │                 pipe.fit(X_tr, y_tr)</w:t>
-              <w:br/>
-            </w:r>
-            <w:r>
-              <w:rPr>
-                <w:rFonts w:ascii="Menlo" w:hAnsi="Menlo"/>
-                <w:color w:val="222222"/>
-                <w:sz w:val="17"/>
-              </w:rPr>
-              <w:t>120 │                 p_cal = pipe.predict_proba(X_cal)[:, 1]</w:t>
-              <w:br/>
-            </w:r>
-            <w:r>
-              <w:rPr>
-                <w:rFonts w:ascii="Menlo" w:hAnsi="Menlo"/>
-                <w:color w:val="222222"/>
-                <w:sz w:val="17"/>
-              </w:rPr>
-              <w:t>121 │                 p_te  = pipe.predict_proba(X_te)[:, 1]</w:t>
-              <w:br/>
-            </w:r>
-            <w:r>
-              <w:rPr>
-                <w:rFonts w:ascii="Menlo" w:hAnsi="Menlo"/>
-                <w:color w:val="222222"/>
-                <w:sz w:val="17"/>
-              </w:rPr>
-              <w:t>122 │             except Exception:</w:t>
-              <w:br/>
-            </w:r>
-            <w:r>
-              <w:rPr>
-                <w:rFonts w:ascii="Menlo" w:hAnsi="Menlo"/>
-                <w:color w:val="222222"/>
-                <w:sz w:val="17"/>
-              </w:rPr>
-              <w:t>123 │                 continue</w:t>
-              <w:br/>
-            </w:r>
-            <w:r>
-              <w:rPr>
-                <w:rFonts w:ascii="Menlo" w:hAnsi="Menlo"/>
-                <w:color w:val="222222"/>
-                <w:sz w:val="17"/>
-              </w:rPr>
-              <w:t xml:space="preserve">124 │ </w:t>
-              <w:br/>
-            </w:r>
-            <w:r>
-              <w:rPr>
-                <w:rFonts w:ascii="Menlo" w:hAnsi="Menlo"/>
-                <w:color w:val="222222"/>
-                <w:sz w:val="17"/>
-              </w:rPr>
-              <w:t>125 │             for a in alphas:</w:t>
-              <w:br/>
-            </w:r>
-            <w:r>
-              <w:rPr>
-                <w:rFonts w:ascii="Menlo" w:hAnsi="Menlo"/>
-                <w:color w:val="222222"/>
-                <w:sz w:val="17"/>
-              </w:rPr>
-              <w:t>126 │                 sets = class_conditional_conformal(p_cal, y_cal.values, p_te, a)</w:t>
-              <w:br/>
-            </w:r>
-            <w:r>
-              <w:rPr>
-                <w:rFonts w:ascii="Menlo" w:hAnsi="Menlo"/>
-                <w:color w:val="222222"/>
-                <w:sz w:val="17"/>
-              </w:rPr>
-              <w:t>127 │                 # set membership: sets[:, 0] = "0" included; sets[:, 1] = "1" included</w:t>
-              <w:br/>
-            </w:r>
-            <w:r>
-              <w:rPr>
-                <w:rFonts w:ascii="Menlo" w:hAnsi="Menlo"/>
-                <w:color w:val="222222"/>
-                <w:sz w:val="17"/>
-              </w:rPr>
-              <w:t>128 │                 set_size = sets.sum(axis=1)</w:t>
-              <w:br/>
-            </w:r>
-            <w:r>
-              <w:rPr>
-                <w:rFonts w:ascii="Menlo" w:hAnsi="Menlo"/>
-                <w:color w:val="222222"/>
-                <w:sz w:val="17"/>
-              </w:rPr>
-              <w:t>129 │                 # coverage: fraction where true label is included</w:t>
-              <w:br/>
-            </w:r>
-            <w:r>
-              <w:rPr>
-                <w:rFonts w:ascii="Menlo" w:hAnsi="Menlo"/>
-                <w:color w:val="222222"/>
-                <w:sz w:val="17"/>
-              </w:rPr>
-              <w:t>130 │                 cov = float(np.mean([sets[i, int(y_te.iloc[i])] for i in range(len(y_te))]))</w:t>
-              <w:br/>
-            </w:r>
-            <w:r>
-              <w:rPr>
-                <w:rFonts w:ascii="Menlo" w:hAnsi="Menlo"/>
-                <w:color w:val="222222"/>
-                <w:sz w:val="17"/>
-              </w:rPr>
-              <w:t>131 │                 # singleton-rule-out: only "0" included, true class included</w:t>
-              <w:br/>
-            </w:r>
-            <w:r>
-              <w:rPr>
-                <w:rFonts w:ascii="Menlo" w:hAnsi="Menlo"/>
-                <w:color w:val="222222"/>
-                <w:sz w:val="17"/>
-              </w:rPr>
-              <w:t>132 │                 rule_out = float(np.mean(sets[:, 0] &amp; (~sets[:, 1])))</w:t>
-              <w:br/>
-            </w:r>
-            <w:r>
-              <w:rPr>
-                <w:rFonts w:ascii="Menlo" w:hAnsi="Menlo"/>
-                <w:color w:val="222222"/>
-                <w:sz w:val="17"/>
-              </w:rPr>
-              <w:t>133 │                 rule_in  = float(np.mean(sets[:, 1] &amp; (~sets[:, 0])))</w:t>
-              <w:br/>
-            </w:r>
-            <w:r>
-              <w:rPr>
-                <w:rFonts w:ascii="Menlo" w:hAnsi="Menlo"/>
-                <w:color w:val="222222"/>
-                <w:sz w:val="17"/>
-              </w:rPr>
-              <w:t>134 │                 singleton = float(np.mean(set_size == 1))</w:t>
-              <w:br/>
-            </w:r>
-            <w:r>
-              <w:rPr>
-                <w:rFonts w:ascii="Menlo" w:hAnsi="Menlo"/>
-                <w:color w:val="222222"/>
-                <w:sz w:val="17"/>
-              </w:rPr>
-              <w:t>135 │                 metrics[a]["coverage"].append(cov)</w:t>
-              <w:br/>
-            </w:r>
-            <w:r>
-              <w:rPr>
-                <w:rFonts w:ascii="Menlo" w:hAnsi="Menlo"/>
-                <w:color w:val="222222"/>
-                <w:sz w:val="17"/>
-              </w:rPr>
-              <w:t>136 │                 metrics[a]["set_size"].append(float(set_size.mean()))</w:t>
-              <w:br/>
-            </w:r>
-            <w:r>
-              <w:rPr>
-                <w:rFonts w:ascii="Menlo" w:hAnsi="Menlo"/>
-                <w:color w:val="222222"/>
-                <w:sz w:val="17"/>
-              </w:rPr>
-              <w:t>137 │                 metrics[a]["singleton_rate"].append(singleton)</w:t>
-              <w:br/>
-            </w:r>
-            <w:r>
-              <w:rPr>
-                <w:rFonts w:ascii="Menlo" w:hAnsi="Menlo"/>
-                <w:color w:val="222222"/>
-                <w:sz w:val="17"/>
-              </w:rPr>
-              <w:t>138 │                 metrics[a]["rule_out_rate"].append(rule_out)</w:t>
-              <w:br/>
-            </w:r>
-            <w:r>
-              <w:rPr>
-                <w:rFonts w:ascii="Menlo" w:hAnsi="Menlo"/>
-                <w:color w:val="222222"/>
-                <w:sz w:val="17"/>
-              </w:rPr>
-              <w:t>139 │                 metrics[a]["rule_in_rate"].append(rule_in)</w:t>
-              <w:br/>
-            </w:r>
-            <w:r>
-              <w:rPr>
-                <w:rFonts w:ascii="Menlo" w:hAnsi="Menlo"/>
-                <w:color w:val="222222"/>
-                <w:sz w:val="17"/>
-              </w:rPr>
-              <w:t>140 │     summary = []</w:t>
-              <w:br/>
-            </w:r>
-            <w:r>
-              <w:rPr>
-                <w:rFonts w:ascii="Menlo" w:hAnsi="Menlo"/>
-                <w:color w:val="222222"/>
-                <w:sz w:val="17"/>
-              </w:rPr>
-              <w:t>141 │     for a in alphas:</w:t>
-              <w:br/>
-            </w:r>
-            <w:r>
-              <w:rPr>
-                <w:rFonts w:ascii="Menlo" w:hAnsi="Menlo"/>
-                <w:color w:val="222222"/>
-                <w:sz w:val="17"/>
-              </w:rPr>
-              <w:t>142 │         s = metrics[a]</w:t>
-              <w:br/>
-            </w:r>
-            <w:r>
-              <w:rPr>
-                <w:rFonts w:ascii="Menlo" w:hAnsi="Menlo"/>
-                <w:color w:val="222222"/>
-                <w:sz w:val="17"/>
-              </w:rPr>
-              <w:t>143 │         if not s["coverage"]: continue</w:t>
-              <w:br/>
-            </w:r>
-            <w:r>
-              <w:rPr>
-                <w:rFonts w:ascii="Menlo" w:hAnsi="Menlo"/>
-                <w:color w:val="222222"/>
-                <w:sz w:val="17"/>
-              </w:rPr>
-              <w:t>144 │         summary.append({</w:t>
-              <w:br/>
-            </w:r>
-            <w:r>
-              <w:rPr>
-                <w:rFonts w:ascii="Menlo" w:hAnsi="Menlo"/>
-                <w:color w:val="222222"/>
-                <w:sz w:val="17"/>
-              </w:rPr>
-              <w:t>145 │             "alpha": a, "target_coverage": 1 - a,</w:t>
-              <w:br/>
-            </w:r>
-            <w:r>
-              <w:rPr>
-                <w:rFonts w:ascii="Menlo" w:hAnsi="Menlo"/>
-                <w:color w:val="222222"/>
-                <w:sz w:val="17"/>
-              </w:rPr>
-              <w:t>146 │             "coverage_mean":   np.mean(s["coverage"]),</w:t>
-              <w:br/>
-            </w:r>
-            <w:r>
-              <w:rPr>
-                <w:rFonts w:ascii="Menlo" w:hAnsi="Menlo"/>
-                <w:color w:val="222222"/>
-                <w:sz w:val="17"/>
-              </w:rPr>
-              <w:t>147 │             "coverage_sd":     np.std(s["coverage"]),</w:t>
-              <w:br/>
-            </w:r>
-            <w:r>
-              <w:rPr>
-                <w:rFonts w:ascii="Menlo" w:hAnsi="Menlo"/>
-                <w:color w:val="222222"/>
-                <w:sz w:val="17"/>
-              </w:rPr>
-              <w:t>148 │             "set_size_mean":   np.mean(s["set_size"]),</w:t>
-              <w:br/>
-            </w:r>
-            <w:r>
-              <w:rPr>
-                <w:rFonts w:ascii="Menlo" w:hAnsi="Menlo"/>
-                <w:color w:val="222222"/>
-                <w:sz w:val="17"/>
-              </w:rPr>
-              <w:t>149 │             "singleton_rate":  np.mean(s["singleton_rate"]),</w:t>
-              <w:br/>
-            </w:r>
-            <w:r>
-              <w:rPr>
-                <w:rFonts w:ascii="Menlo" w:hAnsi="Menlo"/>
-                <w:color w:val="222222"/>
-                <w:sz w:val="17"/>
-              </w:rPr>
-              <w:t>150 │             "rule_out_rate":   np.mean(s["rule_out_rate"]),</w:t>
-              <w:br/>
-            </w:r>
-            <w:r>
-              <w:rPr>
-                <w:rFonts w:ascii="Menlo" w:hAnsi="Menlo"/>
-                <w:color w:val="222222"/>
-                <w:sz w:val="17"/>
-              </w:rPr>
-              <w:t>151 │             "rule_in_rate":    np.mean(s["rule_in_rate"]),</w:t>
-              <w:br/>
-            </w:r>
-            <w:r>
-              <w:rPr>
-                <w:rFonts w:ascii="Menlo" w:hAnsi="Menlo"/>
-                <w:color w:val="222222"/>
-                <w:sz w:val="17"/>
-              </w:rPr>
-              <w:t>152 │         })</w:t>
-              <w:br/>
-            </w:r>
-            <w:r>
-              <w:rPr>
-                <w:rFonts w:ascii="Menlo" w:hAnsi="Menlo"/>
-                <w:color w:val="222222"/>
-                <w:sz w:val="17"/>
-              </w:rPr>
-              <w:t>153 │     return pd.DataFrame(summary)</w:t>
-              <w:br/>
-            </w:r>
-            <w:r>
-              <w:rPr>
-                <w:rFonts w:ascii="Menlo" w:hAnsi="Menlo"/>
-                <w:color w:val="222222"/>
-                <w:sz w:val="17"/>
-              </w:rPr>
-              <w:t xml:space="preserve">154 │ </w:t>
-              <w:br/>
-            </w:r>
-            <w:r>
-              <w:rPr>
-                <w:rFonts w:ascii="Menlo" w:hAnsi="Menlo"/>
-                <w:color w:val="222222"/>
-                <w:sz w:val="17"/>
-              </w:rPr>
-              <w:t xml:space="preserve">155 │ </w:t>
-              <w:br/>
-            </w:r>
-            <w:r>
-              <w:rPr>
-                <w:rFonts w:ascii="Menlo" w:hAnsi="Menlo"/>
-                <w:color w:val="222222"/>
-                <w:sz w:val="17"/>
-              </w:rPr>
-              <w:t>156 │ def main():</w:t>
-              <w:br/>
-            </w:r>
-            <w:r>
-              <w:rPr>
-                <w:rFonts w:ascii="Menlo" w:hAnsi="Menlo"/>
-                <w:color w:val="222222"/>
-                <w:sz w:val="17"/>
-              </w:rPr>
-              <w:t>157 │     df = load_bidmc(); y = df["seizure"].astype(int)</w:t>
-              <w:br/>
-            </w:r>
-            <w:r>
-              <w:rPr>
-                <w:rFonts w:ascii="Menlo" w:hAnsi="Menlo"/>
-                <w:color w:val="222222"/>
-                <w:sz w:val="17"/>
-              </w:rPr>
-              <w:t>158 │     print(f"BIDMC: n={len(df)}, events={int(y.sum())}\n", flush=True)</w:t>
-              <w:br/>
-            </w:r>
-            <w:r>
-              <w:rPr>
-                <w:rFonts w:ascii="Menlo" w:hAnsi="Menlo"/>
-                <w:color w:val="222222"/>
-                <w:sz w:val="17"/>
-              </w:rPr>
-              <w:t xml:space="preserve">159 │ </w:t>
-              <w:br/>
-            </w:r>
-            <w:r>
-              <w:rPr>
-                <w:rFonts w:ascii="Menlo" w:hAnsi="Menlo"/>
-                <w:color w:val="222222"/>
-                <w:sz w:val="17"/>
-              </w:rPr>
-              <w:t>160 │     all_rows = []</w:t>
-              <w:br/>
-            </w:r>
-            <w:r>
-              <w:rPr>
-                <w:rFonts w:ascii="Menlo" w:hAnsi="Menlo"/>
-                <w:color w:val="222222"/>
-                <w:sz w:val="17"/>
-              </w:rPr>
-              <w:t>161 │   ... (83 more lines elided — see full script in scripts/) ...</w:t>
+              <w:t xml:space="preserve"> 68 │     """Class-conditional (Mondrian) split-conformal prediction.</w:t>
+              <w:br/>
+            </w:r>
+            <w:r>
+              <w:rPr>
+                <w:rFonts w:ascii="Menlo" w:hAnsi="Menlo"/>
+                <w:color w:val="222222"/>
+                <w:sz w:val="17"/>
+              </w:rPr>
+              <w:t xml:space="preserve"> 69 │ </w:t>
+              <w:br/>
+            </w:r>
+            <w:r>
+              <w:rPr>
+                <w:rFonts w:ascii="Menlo" w:hAnsi="Menlo"/>
+                <w:color w:val="222222"/>
+                <w:sz w:val="17"/>
+              </w:rPr>
+              <w:t xml:space="preserve"> 70 │     For each class c separately, the nonconformity score is</w:t>
+              <w:br/>
+            </w:r>
+            <w:r>
+              <w:rPr>
+                <w:rFonts w:ascii="Menlo" w:hAnsi="Menlo"/>
+                <w:color w:val="222222"/>
+                <w:sz w:val="17"/>
+              </w:rPr>
+              <w:t xml:space="preserve"> 71 │     s_i = 1 − P(y_i = c | x_i), evaluated on the calibration set.  The</w:t>
+              <w:br/>
+            </w:r>
+            <w:r>
+              <w:rPr>
+                <w:rFonts w:ascii="Menlo" w:hAnsi="Menlo"/>
+                <w:color w:val="222222"/>
+                <w:sz w:val="17"/>
+              </w:rPr>
+              <w:t xml:space="preserve"> 72 │     (1−α)(n_c+1)/n_c empirical quantile q_c (with finite-sample correction)</w:t>
+              <w:br/>
+            </w:r>
+            <w:r>
+              <w:rPr>
+                <w:rFonts w:ascii="Menlo" w:hAnsi="Menlo"/>
+                <w:color w:val="222222"/>
+                <w:sz w:val="17"/>
+              </w:rPr>
+              <w:t xml:space="preserve"> 73 │     becomes the threshold.  A test point's prediction set includes class c</w:t>
+              <w:br/>
+            </w:r>
+            <w:r>
+              <w:rPr>
+                <w:rFonts w:ascii="Menlo" w:hAnsi="Menlo"/>
+                <w:color w:val="222222"/>
+                <w:sz w:val="17"/>
+              </w:rPr>
+              <w:t xml:space="preserve"> 74 │     iff its nonconformity for c does not exceed q_c.</w:t>
+              <w:br/>
+            </w:r>
+            <w:r>
+              <w:rPr>
+                <w:rFonts w:ascii="Menlo" w:hAnsi="Menlo"/>
+                <w:color w:val="222222"/>
+                <w:sz w:val="17"/>
+              </w:rPr>
+              <w:t xml:space="preserve"> 75 │ </w:t>
+              <w:br/>
+            </w:r>
+            <w:r>
+              <w:rPr>
+                <w:rFonts w:ascii="Menlo" w:hAnsi="Menlo"/>
+                <w:color w:val="222222"/>
+                <w:sz w:val="17"/>
+              </w:rPr>
+              <w:t xml:space="preserve"> 76 │     By construction the marginal coverage within each true class is at</w:t>
+              <w:br/>
+            </w:r>
+            <w:r>
+              <w:rPr>
+                <w:rFonts w:ascii="Menlo" w:hAnsi="Menlo"/>
+                <w:color w:val="222222"/>
+                <w:sz w:val="17"/>
+              </w:rPr>
+              <w:t xml:space="preserve"> 77 │     least 1 − α — the Mondrian guarantee.</w:t>
+              <w:br/>
+            </w:r>
+            <w:r>
+              <w:rPr>
+                <w:rFonts w:ascii="Menlo" w:hAnsi="Menlo"/>
+                <w:color w:val="222222"/>
+                <w:sz w:val="17"/>
+              </w:rPr>
+              <w:t xml:space="preserve"> 78 │ </w:t>
+              <w:br/>
+            </w:r>
+            <w:r>
+              <w:rPr>
+                <w:rFonts w:ascii="Menlo" w:hAnsi="Menlo"/>
+                <w:color w:val="222222"/>
+                <w:sz w:val="17"/>
+              </w:rPr>
+              <w:t xml:space="preserve"> 79 │     Parameters</w:t>
+              <w:br/>
+            </w:r>
+            <w:r>
+              <w:rPr>
+                <w:rFonts w:ascii="Menlo" w:hAnsi="Menlo"/>
+                <w:color w:val="222222"/>
+                <w:sz w:val="17"/>
+              </w:rPr>
+              <w:t xml:space="preserve"> 80 │     ----------</w:t>
+              <w:br/>
+            </w:r>
+            <w:r>
+              <w:rPr>
+                <w:rFonts w:ascii="Menlo" w:hAnsi="Menlo"/>
+                <w:color w:val="222222"/>
+                <w:sz w:val="17"/>
+              </w:rPr>
+              <w:t xml:space="preserve"> 81 │     p_cal : array of P(y=1) on the calibration set.</w:t>
+              <w:br/>
+            </w:r>
+            <w:r>
+              <w:rPr>
+                <w:rFonts w:ascii="Menlo" w:hAnsi="Menlo"/>
+                <w:color w:val="222222"/>
+                <w:sz w:val="17"/>
+              </w:rPr>
+              <w:t xml:space="preserve"> 82 │     y_cal : binary calibration outcomes.</w:t>
+              <w:br/>
+            </w:r>
+            <w:r>
+              <w:rPr>
+                <w:rFonts w:ascii="Menlo" w:hAnsi="Menlo"/>
+                <w:color w:val="222222"/>
+                <w:sz w:val="17"/>
+              </w:rPr>
+              <w:t xml:space="preserve"> 83 │     p_test : array of P(y=1) on the test set.</w:t>
+              <w:br/>
+            </w:r>
+            <w:r>
+              <w:rPr>
+                <w:rFonts w:ascii="Menlo" w:hAnsi="Menlo"/>
+                <w:color w:val="222222"/>
+                <w:sz w:val="17"/>
+              </w:rPr>
+              <w:t xml:space="preserve"> 84 │     alpha : target miscoverage in (0, 1).</w:t>
+              <w:br/>
+            </w:r>
+            <w:r>
+              <w:rPr>
+                <w:rFonts w:ascii="Menlo" w:hAnsi="Menlo"/>
+                <w:color w:val="222222"/>
+                <w:sz w:val="17"/>
+              </w:rPr>
+              <w:t xml:space="preserve"> 85 │ </w:t>
+              <w:br/>
+            </w:r>
+            <w:r>
+              <w:rPr>
+                <w:rFonts w:ascii="Menlo" w:hAnsi="Menlo"/>
+                <w:color w:val="222222"/>
+                <w:sz w:val="17"/>
+              </w:rPr>
+              <w:t xml:space="preserve"> 86 │     Returns</w:t>
+              <w:br/>
+            </w:r>
+            <w:r>
+              <w:rPr>
+                <w:rFonts w:ascii="Menlo" w:hAnsi="Menlo"/>
+                <w:color w:val="222222"/>
+                <w:sz w:val="17"/>
+              </w:rPr>
+              <w:t xml:space="preserve"> 87 │     -------</w:t>
+              <w:br/>
+            </w:r>
+            <w:r>
+              <w:rPr>
+                <w:rFonts w:ascii="Menlo" w:hAnsi="Menlo"/>
+                <w:color w:val="222222"/>
+                <w:sz w:val="17"/>
+              </w:rPr>
+              <w:t xml:space="preserve"> 88 │     np.ndarray of shape (n_test, 2) of booleans.  Column 0 is whether class</w:t>
+              <w:br/>
+            </w:r>
+            <w:r>
+              <w:rPr>
+                <w:rFonts w:ascii="Menlo" w:hAnsi="Menlo"/>
+                <w:color w:val="222222"/>
+                <w:sz w:val="17"/>
+              </w:rPr>
+              <w:t xml:space="preserve"> 89 │     'no seizure' (y=0) is included in the prediction set; column 1 is</w:t>
+              <w:br/>
+            </w:r>
+            <w:r>
+              <w:rPr>
+                <w:rFonts w:ascii="Menlo" w:hAnsi="Menlo"/>
+                <w:color w:val="222222"/>
+                <w:sz w:val="17"/>
+              </w:rPr>
+              <w:t xml:space="preserve"> 90 │     whether class 'seizure' (y=1) is included.</w:t>
+              <w:br/>
+            </w:r>
+            <w:r>
+              <w:rPr>
+                <w:rFonts w:ascii="Menlo" w:hAnsi="Menlo"/>
+                <w:color w:val="222222"/>
+                <w:sz w:val="17"/>
+              </w:rPr>
+              <w:t xml:space="preserve"> 91 │ </w:t>
+              <w:br/>
+            </w:r>
+            <w:r>
+              <w:rPr>
+                <w:rFonts w:ascii="Menlo" w:hAnsi="Menlo"/>
+                <w:color w:val="222222"/>
+                <w:sz w:val="17"/>
+              </w:rPr>
+              <w:t xml:space="preserve"> 92 │     References</w:t>
+              <w:br/>
+            </w:r>
+            <w:r>
+              <w:rPr>
+                <w:rFonts w:ascii="Menlo" w:hAnsi="Menlo"/>
+                <w:color w:val="222222"/>
+                <w:sz w:val="17"/>
+              </w:rPr>
+              <w:t xml:space="preserve"> 93 │     ----------</w:t>
+              <w:br/>
+            </w:r>
+            <w:r>
+              <w:rPr>
+                <w:rFonts w:ascii="Menlo" w:hAnsi="Menlo"/>
+                <w:color w:val="222222"/>
+                <w:sz w:val="17"/>
+              </w:rPr>
+              <w:t xml:space="preserve"> 94 │     Vovk V, Gammerman A, Shafer G.  Algorithmic Learning in a Random World.</w:t>
+              <w:br/>
+            </w:r>
+            <w:r>
+              <w:rPr>
+                <w:rFonts w:ascii="Menlo" w:hAnsi="Menlo"/>
+                <w:color w:val="222222"/>
+                <w:sz w:val="17"/>
+              </w:rPr>
+              <w:t xml:space="preserve"> 95 │         Springer, 2005.  (Foundational conformal-prediction reference.)</w:t>
+              <w:br/>
+            </w:r>
+            <w:r>
+              <w:rPr>
+                <w:rFonts w:ascii="Menlo" w:hAnsi="Menlo"/>
+                <w:color w:val="222222"/>
+                <w:sz w:val="17"/>
+              </w:rPr>
+              <w:t xml:space="preserve"> 96 │     Angelopoulos AN, Bates S.  A gentle introduction to conformal prediction.</w:t>
+              <w:br/>
+            </w:r>
+            <w:r>
+              <w:rPr>
+                <w:rFonts w:ascii="Menlo" w:hAnsi="Menlo"/>
+                <w:color w:val="222222"/>
+                <w:sz w:val="17"/>
+              </w:rPr>
+              <w:t xml:space="preserve"> 97 │         arXiv:2107.07511, 2021.  (Modern tutorial including Mondrian.)</w:t>
+              <w:br/>
+            </w:r>
+            <w:r>
+              <w:rPr>
+                <w:rFonts w:ascii="Menlo" w:hAnsi="Menlo"/>
+                <w:color w:val="222222"/>
+                <w:sz w:val="17"/>
+              </w:rPr>
+              <w:t xml:space="preserve"> 98 │     García-Cremades S et al.  Class-conditional conformal prediction for MACE</w:t>
+              <w:br/>
+            </w:r>
+            <w:r>
+              <w:rPr>
+                <w:rFonts w:ascii="Menlo" w:hAnsi="Menlo"/>
+                <w:color w:val="222222"/>
+                <w:sz w:val="17"/>
+              </w:rPr>
+              <w:t xml:space="preserve"> 99 │         rule-out.  PMLR 252, 2024.  (Clinical application — rule-out fraction</w:t>
+              <w:br/>
+            </w:r>
+            <w:r>
+              <w:rPr>
+                <w:rFonts w:ascii="Menlo" w:hAnsi="Menlo"/>
+                <w:color w:val="222222"/>
+                <w:sz w:val="17"/>
+              </w:rPr>
+              <w:t>100 │         as the headline metric, exactly as we use it here.)</w:t>
+              <w:br/>
+            </w:r>
+            <w:r>
+              <w:rPr>
+                <w:rFonts w:ascii="Menlo" w:hAnsi="Menlo"/>
+                <w:color w:val="222222"/>
+                <w:sz w:val="17"/>
+              </w:rPr>
+              <w:t>101 │     """</w:t>
+              <w:br/>
+            </w:r>
+            <w:r>
+              <w:rPr>
+                <w:rFonts w:ascii="Menlo" w:hAnsi="Menlo"/>
+                <w:color w:val="222222"/>
+                <w:sz w:val="17"/>
+              </w:rPr>
+              <w:t>102 │     p_cal = np.clip(p_cal, 1e-6, 1 - 1e-6)</w:t>
+              <w:br/>
+            </w:r>
+            <w:r>
+              <w:rPr>
+                <w:rFonts w:ascii="Menlo" w:hAnsi="Menlo"/>
+                <w:color w:val="222222"/>
+                <w:sz w:val="17"/>
+              </w:rPr>
+              <w:t>103 │     p_test = np.clip(p_test, 1e-6, 1 - 1e-6)</w:t>
+              <w:br/>
+            </w:r>
+            <w:r>
+              <w:rPr>
+                <w:rFonts w:ascii="Menlo" w:hAnsi="Menlo"/>
+                <w:color w:val="222222"/>
+                <w:sz w:val="17"/>
+              </w:rPr>
+              <w:t>104 │     # nonconformity = 1 - P(true class) on calibration set</w:t>
+              <w:br/>
+            </w:r>
+            <w:r>
+              <w:rPr>
+                <w:rFonts w:ascii="Menlo" w:hAnsi="Menlo"/>
+                <w:color w:val="222222"/>
+                <w:sz w:val="17"/>
+              </w:rPr>
+              <w:t>105 │     nc_pos = 1.0 - p_cal[y_cal == 1]      # cases where true=1</w:t>
+              <w:br/>
+            </w:r>
+            <w:r>
+              <w:rPr>
+                <w:rFonts w:ascii="Menlo" w:hAnsi="Menlo"/>
+                <w:color w:val="222222"/>
+                <w:sz w:val="17"/>
+              </w:rPr>
+              <w:t>106 │     nc_neg = 1.0 - (1.0 - p_cal[y_cal == 0])  # cases where true=0 → 1-P(y=0)</w:t>
+              <w:br/>
+            </w:r>
+            <w:r>
+              <w:rPr>
+                <w:rFonts w:ascii="Menlo" w:hAnsi="Menlo"/>
+                <w:color w:val="222222"/>
+                <w:sz w:val="17"/>
+              </w:rPr>
+              <w:t>107 │     if len(nc_pos) &lt; 2 or len(nc_neg) &lt; 2:</w:t>
+              <w:br/>
+            </w:r>
+            <w:r>
+              <w:rPr>
+                <w:rFonts w:ascii="Menlo" w:hAnsi="Menlo"/>
+                <w:color w:val="222222"/>
+                <w:sz w:val="17"/>
+              </w:rPr>
+              <w:t>108 │         return np.zeros((len(p_test), 2), dtype=bool)</w:t>
+              <w:br/>
+            </w:r>
+            <w:r>
+              <w:rPr>
+                <w:rFonts w:ascii="Menlo" w:hAnsi="Menlo"/>
+                <w:color w:val="222222"/>
+                <w:sz w:val="17"/>
+              </w:rPr>
+              <w:t>109 │     # finite-sample correction: (n+1)(1-α)/n th value</w:t>
+              <w:br/>
+            </w:r>
+            <w:r>
+              <w:rPr>
+                <w:rFonts w:ascii="Menlo" w:hAnsi="Menlo"/>
+                <w:color w:val="222222"/>
+                <w:sz w:val="17"/>
+              </w:rPr>
+              <w:t>110 │     n_pos = len(nc_pos); n_neg = len(nc_neg)</w:t>
+              <w:br/>
+            </w:r>
+            <w:r>
+              <w:rPr>
+                <w:rFonts w:ascii="Menlo" w:hAnsi="Menlo"/>
+                <w:color w:val="222222"/>
+                <w:sz w:val="17"/>
+              </w:rPr>
+              <w:t>111 │     q_pos = np.quantile(nc_pos, min(1.0, (1 - alpha) * (n_pos + 1) / n_pos))</w:t>
+              <w:br/>
+            </w:r>
+            <w:r>
+              <w:rPr>
+                <w:rFonts w:ascii="Menlo" w:hAnsi="Menlo"/>
+                <w:color w:val="222222"/>
+                <w:sz w:val="17"/>
+              </w:rPr>
+              <w:t>112 │     q_neg = np.quantile(nc_neg, min(1.0, (1 - alpha) * (n_neg + 1) / n_neg))</w:t>
+              <w:br/>
+            </w:r>
+            <w:r>
+              <w:rPr>
+                <w:rFonts w:ascii="Menlo" w:hAnsi="Menlo"/>
+                <w:color w:val="222222"/>
+                <w:sz w:val="17"/>
+              </w:rPr>
+              <w:t>113 │     # for each test point, include class c if its nonconformity ≤ q_c</w:t>
+              <w:br/>
+            </w:r>
+            <w:r>
+              <w:rPr>
+                <w:rFonts w:ascii="Menlo" w:hAnsi="Menlo"/>
+                <w:color w:val="222222"/>
+                <w:sz w:val="17"/>
+              </w:rPr>
+              <w:t>114 │     include_pos = (1.0 - p_test)         &lt;= q_pos       # include "1" if (1-P(1)) ≤ q_pos</w:t>
+              <w:br/>
+            </w:r>
+            <w:r>
+              <w:rPr>
+                <w:rFonts w:ascii="Menlo" w:hAnsi="Menlo"/>
+                <w:color w:val="222222"/>
+                <w:sz w:val="17"/>
+              </w:rPr>
+              <w:t>115 │     include_neg = (1.0 - (1.0 - p_test)) &lt;= q_neg       # include "0" if (1-P(0)) ≤ q_neg</w:t>
+              <w:br/>
+            </w:r>
+            <w:r>
+              <w:rPr>
+                <w:rFonts w:ascii="Menlo" w:hAnsi="Menlo"/>
+                <w:color w:val="222222"/>
+                <w:sz w:val="17"/>
+              </w:rPr>
+              <w:t>116 │     return np.column_stack([include_neg, include_pos]).astype(bool)</w:t>
+              <w:br/>
+            </w:r>
+            <w:r>
+              <w:rPr>
+                <w:rFonts w:ascii="Menlo" w:hAnsi="Menlo"/>
+                <w:color w:val="222222"/>
+                <w:sz w:val="17"/>
+              </w:rPr>
+              <w:t xml:space="preserve">117 │ </w:t>
+              <w:br/>
+            </w:r>
+            <w:r>
+              <w:rPr>
+                <w:rFonts w:ascii="Menlo" w:hAnsi="Menlo"/>
+                <w:color w:val="222222"/>
+                <w:sz w:val="17"/>
+              </w:rPr>
+              <w:t xml:space="preserve">118 │ </w:t>
+              <w:br/>
+            </w:r>
+            <w:r>
+              <w:rPr>
+                <w:rFonts w:ascii="Menlo" w:hAnsi="Menlo"/>
+                <w:color w:val="222222"/>
+                <w:sz w:val="17"/>
+              </w:rPr>
+              <w:t>119 │ def evaluate_conformal(make_pipe_fn, features, X, y, alphas=ALPHAS,</w:t>
+              <w:br/>
+            </w:r>
+            <w:r>
+              <w:rPr>
+                <w:rFonts w:ascii="Menlo" w:hAnsi="Menlo"/>
+                <w:color w:val="222222"/>
+                <w:sz w:val="17"/>
+              </w:rPr>
+              <w:t>120 │                         n_splits=N_SPLITS, n_repeats=N_REPEATS):</w:t>
+              <w:br/>
+            </w:r>
+            <w:r>
+              <w:rPr>
+                <w:rFonts w:ascii="Menlo" w:hAnsi="Menlo"/>
+                <w:color w:val="222222"/>
+                <w:sz w:val="17"/>
+              </w:rPr>
+              <w:t>121 │     """Cross-conformal: split → fit on train, calibrate on val, predict on test.</w:t>
+              <w:br/>
+            </w:r>
+            <w:r>
+              <w:rPr>
+                <w:rFonts w:ascii="Menlo" w:hAnsi="Menlo"/>
+                <w:color w:val="222222"/>
+                <w:sz w:val="17"/>
+              </w:rPr>
+              <w:t>122 │     We use a 3-way split per fold: train (60%), calibration (20%), test (20%).</w:t>
+              <w:br/>
+            </w:r>
+            <w:r>
+              <w:rPr>
+                <w:rFonts w:ascii="Menlo" w:hAnsi="Menlo"/>
+                <w:color w:val="222222"/>
+                <w:sz w:val="17"/>
+              </w:rPr>
+              <w:t>123 │     Aggregate metrics over repeated CV.</w:t>
+              <w:br/>
+            </w:r>
+            <w:r>
+              <w:rPr>
+                <w:rFonts w:ascii="Menlo" w:hAnsi="Menlo"/>
+                <w:color w:val="222222"/>
+                <w:sz w:val="17"/>
+              </w:rPr>
+              <w:t>124 │     """</w:t>
+              <w:br/>
+            </w:r>
+            <w:r>
+              <w:rPr>
+                <w:rFonts w:ascii="Menlo" w:hAnsi="Menlo"/>
+                <w:color w:val="222222"/>
+                <w:sz w:val="17"/>
+              </w:rPr>
+              <w:t>125 │     metrics = {a: {"coverage": [], "set_size": [], "singleton_rate": [],</w:t>
+              <w:br/>
+            </w:r>
+            <w:r>
+              <w:rPr>
+                <w:rFonts w:ascii="Menlo" w:hAnsi="Menlo"/>
+                <w:color w:val="222222"/>
+                <w:sz w:val="17"/>
+              </w:rPr>
+              <w:t>126 │                     "rule_out_rate": [], "rule_in_rate": []} for a in alphas}</w:t>
+              <w:br/>
+            </w:r>
+            <w:r>
+              <w:rPr>
+                <w:rFonts w:ascii="Menlo" w:hAnsi="Menlo"/>
+                <w:color w:val="222222"/>
+                <w:sz w:val="17"/>
+              </w:rPr>
+              <w:t>127 │     rng = np.random.default_rng(SEED)</w:t>
+              <w:br/>
+            </w:r>
+            <w:r>
+              <w:rPr>
+                <w:rFonts w:ascii="Menlo" w:hAnsi="Menlo"/>
+                <w:color w:val="222222"/>
+                <w:sz w:val="17"/>
+              </w:rPr>
+              <w:t>128 │     for rep in range(n_repeats):</w:t>
+              <w:br/>
+            </w:r>
+            <w:r>
+              <w:rPr>
+                <w:rFonts w:ascii="Menlo" w:hAnsi="Menlo"/>
+                <w:color w:val="222222"/>
+                <w:sz w:val="17"/>
+              </w:rPr>
+              <w:t>129 │         skf = StratifiedKFold(n_splits=n_splits, shuffle=True,</w:t>
+              <w:br/>
+            </w:r>
+            <w:r>
+              <w:rPr>
+                <w:rFonts w:ascii="Menlo" w:hAnsi="Menlo"/>
+                <w:color w:val="222222"/>
+                <w:sz w:val="17"/>
+              </w:rPr>
+              <w:t>130 │                                 random_state=SEED + rep)</w:t>
+              <w:br/>
+            </w:r>
+            <w:r>
+              <w:rPr>
+                <w:rFonts w:ascii="Menlo" w:hAnsi="Menlo"/>
+                <w:color w:val="222222"/>
+                <w:sz w:val="17"/>
+              </w:rPr>
+              <w:t>131 │         for fold_idx, (trainval, test) in enumerate(skf.split(X, y)):</w:t>
+              <w:br/>
+            </w:r>
+            <w:r>
+              <w:rPr>
+                <w:rFonts w:ascii="Menlo" w:hAnsi="Menlo"/>
+                <w:color w:val="222222"/>
+                <w:sz w:val="17"/>
+              </w:rPr>
+              <w:t>132 │             # Split trainval → train (75%) + cal (25%)</w:t>
+              <w:br/>
+            </w:r>
+            <w:r>
+              <w:rPr>
+                <w:rFonts w:ascii="Menlo" w:hAnsi="Menlo"/>
+                <w:color w:val="222222"/>
+                <w:sz w:val="17"/>
+              </w:rPr>
+              <w:t>133 │             yv = y.iloc[trainval]</w:t>
+              <w:br/>
+            </w:r>
+            <w:r>
+              <w:rPr>
+                <w:rFonts w:ascii="Menlo" w:hAnsi="Menlo"/>
+                <w:color w:val="222222"/>
+                <w:sz w:val="17"/>
+              </w:rPr>
+              <w:t>134 │             pos_v = np.where(yv == 1)[0]; neg_v = np.where(yv == 0)[0]</w:t>
+              <w:br/>
+            </w:r>
+            <w:r>
+              <w:rPr>
+                <w:rFonts w:ascii="Menlo" w:hAnsi="Menlo"/>
+                <w:color w:val="222222"/>
+                <w:sz w:val="17"/>
+              </w:rPr>
+              <w:t>135 │             rng_l = np.random.default_rng(SEED + rep * 100 + fold_idx)</w:t>
+              <w:br/>
+            </w:r>
+            <w:r>
+              <w:rPr>
+                <w:rFonts w:ascii="Menlo" w:hAnsi="Menlo"/>
+                <w:color w:val="222222"/>
+                <w:sz w:val="17"/>
+              </w:rPr>
+              <w:t>136 │             rng_l.shuffle(pos_v); rng_l.shuffle(neg_v)</w:t>
+              <w:br/>
+            </w:r>
+            <w:r>
+              <w:rPr>
+                <w:rFonts w:ascii="Menlo" w:hAnsi="Menlo"/>
+                <w:color w:val="222222"/>
+                <w:sz w:val="17"/>
+              </w:rPr>
+              <w:t>137 │             cal_pos = pos_v[: max(2, len(pos_v) // 4)]</w:t>
+              <w:br/>
+            </w:r>
+            <w:r>
+              <w:rPr>
+                <w:rFonts w:ascii="Menlo" w:hAnsi="Menlo"/>
+                <w:color w:val="222222"/>
+                <w:sz w:val="17"/>
+              </w:rPr>
+              <w:t>138 │             cal_neg = neg_v[: max(2, len(neg_v) // 4)]</w:t>
+              <w:br/>
+            </w:r>
+            <w:r>
+              <w:rPr>
+                <w:rFonts w:ascii="Menlo" w:hAnsi="Menlo"/>
+                <w:color w:val="222222"/>
+                <w:sz w:val="17"/>
+              </w:rPr>
+              <w:t>139 │             cal_idx = trainval[np.concatenate([cal_pos, cal_neg])]</w:t>
+              <w:br/>
+            </w:r>
+            <w:r>
+              <w:rPr>
+                <w:rFonts w:ascii="Menlo" w:hAnsi="Menlo"/>
+                <w:color w:val="222222"/>
+                <w:sz w:val="17"/>
+              </w:rPr>
+              <w:t>140 │             train_idx = np.setdiff1d(trainval, cal_idx)</w:t>
+              <w:br/>
+            </w:r>
+            <w:r>
+              <w:rPr>
+                <w:rFonts w:ascii="Menlo" w:hAnsi="Menlo"/>
+                <w:color w:val="222222"/>
+                <w:sz w:val="17"/>
+              </w:rPr>
+              <w:t>141 │             X_tr, y_tr = X.iloc[train_idx], y.iloc[train_idx]</w:t>
+              <w:br/>
+            </w:r>
+            <w:r>
+              <w:rPr>
+                <w:rFonts w:ascii="Menlo" w:hAnsi="Menlo"/>
+                <w:color w:val="222222"/>
+                <w:sz w:val="17"/>
+              </w:rPr>
+              <w:t>142 │             X_cal, y_cal = X.iloc[cal_idx], y.iloc[cal_idx]</w:t>
+              <w:br/>
+            </w:r>
+            <w:r>
+              <w:rPr>
+                <w:rFonts w:ascii="Menlo" w:hAnsi="Menlo"/>
+                <w:color w:val="222222"/>
+                <w:sz w:val="17"/>
+              </w:rPr>
+              <w:t>143 │             X_te, y_te = X.iloc[test], y.iloc[test]</w:t>
+              <w:br/>
+            </w:r>
+            <w:r>
+              <w:rPr>
+                <w:rFonts w:ascii="Menlo" w:hAnsi="Menlo"/>
+                <w:color w:val="222222"/>
+                <w:sz w:val="17"/>
+              </w:rPr>
+              <w:t>144 │             if y_tr.sum() &lt; 5 or y_cal.sum() &lt; 2: continue</w:t>
+              <w:br/>
+            </w:r>
+            <w:r>
+              <w:rPr>
+                <w:rFonts w:ascii="Menlo" w:hAnsi="Menlo"/>
+                <w:color w:val="222222"/>
+                <w:sz w:val="17"/>
+              </w:rPr>
+              <w:t xml:space="preserve">145 │ </w:t>
+              <w:br/>
+            </w:r>
+            <w:r>
+              <w:rPr>
+                <w:rFonts w:ascii="Menlo" w:hAnsi="Menlo"/>
+                <w:color w:val="222222"/>
+                <w:sz w:val="17"/>
+              </w:rPr>
+              <w:t>146 │             try:</w:t>
+              <w:br/>
+            </w:r>
+            <w:r>
+              <w:rPr>
+                <w:rFonts w:ascii="Menlo" w:hAnsi="Menlo"/>
+                <w:color w:val="222222"/>
+                <w:sz w:val="17"/>
+              </w:rPr>
+              <w:t>147 │                 pipe = make_pipe_fn()</w:t>
+              <w:br/>
+            </w:r>
+            <w:r>
+              <w:rPr>
+                <w:rFonts w:ascii="Menlo" w:hAnsi="Menlo"/>
+                <w:color w:val="222222"/>
+                <w:sz w:val="17"/>
+              </w:rPr>
+              <w:t>148 │                 pipe.fit(X_tr, y_tr)</w:t>
+              <w:br/>
+            </w:r>
+            <w:r>
+              <w:rPr>
+                <w:rFonts w:ascii="Menlo" w:hAnsi="Menlo"/>
+                <w:color w:val="222222"/>
+                <w:sz w:val="17"/>
+              </w:rPr>
+              <w:t>149 │                 p_cal = pipe.predict_proba(X_cal)[:, 1]</w:t>
+              <w:br/>
+            </w:r>
+            <w:r>
+              <w:rPr>
+                <w:rFonts w:ascii="Menlo" w:hAnsi="Menlo"/>
+                <w:color w:val="222222"/>
+                <w:sz w:val="17"/>
+              </w:rPr>
+              <w:t>150 │                 p_te  = pipe.predict_proba(X_te)[:, 1]</w:t>
+              <w:br/>
+            </w:r>
+            <w:r>
+              <w:rPr>
+                <w:rFonts w:ascii="Menlo" w:hAnsi="Menlo"/>
+                <w:color w:val="222222"/>
+                <w:sz w:val="17"/>
+              </w:rPr>
+              <w:t>151 │             except Exception:</w:t>
+              <w:br/>
+            </w:r>
+            <w:r>
+              <w:rPr>
+                <w:rFonts w:ascii="Menlo" w:hAnsi="Menlo"/>
+                <w:color w:val="222222"/>
+                <w:sz w:val="17"/>
+              </w:rPr>
+              <w:t>152 │                 continue</w:t>
+              <w:br/>
+            </w:r>
+            <w:r>
+              <w:rPr>
+                <w:rFonts w:ascii="Menlo" w:hAnsi="Menlo"/>
+                <w:color w:val="222222"/>
+                <w:sz w:val="17"/>
+              </w:rPr>
+              <w:t xml:space="preserve">153 │ </w:t>
+              <w:br/>
+            </w:r>
+            <w:r>
+              <w:rPr>
+                <w:rFonts w:ascii="Menlo" w:hAnsi="Menlo"/>
+                <w:color w:val="222222"/>
+                <w:sz w:val="17"/>
+              </w:rPr>
+              <w:t>154 │             for a in alphas:</w:t>
+              <w:br/>
+            </w:r>
+            <w:r>
+              <w:rPr>
+                <w:rFonts w:ascii="Menlo" w:hAnsi="Menlo"/>
+                <w:color w:val="222222"/>
+                <w:sz w:val="17"/>
+              </w:rPr>
+              <w:t>155 │                 sets = class_conditional_conformal(p_cal, y_cal.values, p_te, a)</w:t>
+              <w:br/>
+            </w:r>
+            <w:r>
+              <w:rPr>
+                <w:rFonts w:ascii="Menlo" w:hAnsi="Menlo"/>
+                <w:color w:val="222222"/>
+                <w:sz w:val="17"/>
+              </w:rPr>
+              <w:t>156 │                 # set membership: sets[:, 0] = "0" included; sets[:, 1] = "1" included</w:t>
+              <w:br/>
+            </w:r>
+            <w:r>
+              <w:rPr>
+                <w:rFonts w:ascii="Menlo" w:hAnsi="Menlo"/>
+                <w:color w:val="222222"/>
+                <w:sz w:val="17"/>
+              </w:rPr>
+              <w:t>157 │                 set_size = sets.sum(axis=1)</w:t>
+              <w:br/>
+            </w:r>
+            <w:r>
+              <w:rPr>
+                <w:rFonts w:ascii="Menlo" w:hAnsi="Menlo"/>
+                <w:color w:val="222222"/>
+                <w:sz w:val="17"/>
+              </w:rPr>
+              <w:t>158 │                 # coverage: fraction where true label is included</w:t>
+              <w:br/>
+            </w:r>
+            <w:r>
+              <w:rPr>
+                <w:rFonts w:ascii="Menlo" w:hAnsi="Menlo"/>
+                <w:color w:val="222222"/>
+                <w:sz w:val="17"/>
+              </w:rPr>
+              <w:t>159 │                 cov = float(np.mean([sets[i, int(y_te.iloc[i])] for i in range(len(y_te))]))</w:t>
+              <w:br/>
+            </w:r>
+            <w:r>
+              <w:rPr>
+                <w:rFonts w:ascii="Menlo" w:hAnsi="Menlo"/>
+                <w:color w:val="222222"/>
+                <w:sz w:val="17"/>
+              </w:rPr>
+              <w:t>160 │                 # singleton-rule-out: only "0" included, true class included</w:t>
+              <w:br/>
+            </w:r>
+            <w:r>
+              <w:rPr>
+                <w:rFonts w:ascii="Menlo" w:hAnsi="Menlo"/>
+                <w:color w:val="222222"/>
+                <w:sz w:val="17"/>
+              </w:rPr>
+              <w:t>161 │   ... (112 more lines elided — see full script in scripts/) ...</w:t>
             </w:r>
           </w:p>
         </w:tc>
@@ -14998,619 +15232,619 @@
                 <w:color w:val="222222"/>
                 <w:sz w:val="17"/>
               </w:rPr>
-              <w:t xml:space="preserve">  3 │   // Build raw vector in feature order</w:t>
-              <w:br/>
-            </w:r>
-            <w:r>
-              <w:rPr>
-                <w:rFonts w:ascii="Menlo" w:hAnsi="Menlo"/>
-                <w:color w:val="222222"/>
-                <w:sz w:val="17"/>
-              </w:rPr>
-              <w:t xml:space="preserve">  4 │   const raw = FIRTH_FEATURES_ORDER.map(f =&gt; getInputValue(f));</w:t>
-              <w:br/>
-            </w:r>
-            <w:r>
-              <w:rPr>
-                <w:rFonts w:ascii="Menlo" w:hAnsi="Menlo"/>
-                <w:color w:val="222222"/>
-                <w:sz w:val="17"/>
-              </w:rPr>
-              <w:t xml:space="preserve">  5 │   const means = MODEL.model.feature_means;</w:t>
-              <w:br/>
-            </w:r>
-            <w:r>
-              <w:rPr>
-                <w:rFonts w:ascii="Menlo" w:hAnsi="Menlo"/>
-                <w:color w:val="222222"/>
-                <w:sz w:val="17"/>
-              </w:rPr>
-              <w:t xml:space="preserve">  6 │   const sds   = MODEL.model.feature_sds;</w:t>
-              <w:br/>
-            </w:r>
-            <w:r>
-              <w:rPr>
-                <w:rFonts w:ascii="Menlo" w:hAnsi="Menlo"/>
-                <w:color w:val="222222"/>
-                <w:sz w:val="17"/>
-              </w:rPr>
-              <w:t xml:space="preserve">  7 │   const coefs = MODEL.model.coefficients;</w:t>
-              <w:br/>
-            </w:r>
-            <w:r>
-              <w:rPr>
-                <w:rFonts w:ascii="Menlo" w:hAnsi="Menlo"/>
-                <w:color w:val="222222"/>
-                <w:sz w:val="17"/>
-              </w:rPr>
-              <w:t xml:space="preserve">  8 │   const intercept = MODEL.model.intercept;</w:t>
-              <w:br/>
-            </w:r>
-            <w:r>
-              <w:rPr>
-                <w:rFonts w:ascii="Menlo" w:hAnsi="Menlo"/>
-                <w:color w:val="222222"/>
-                <w:sz w:val="17"/>
-              </w:rPr>
-              <w:t xml:space="preserve">  9 │   // z-scale</w:t>
-              <w:br/>
-            </w:r>
-            <w:r>
-              <w:rPr>
-                <w:rFonts w:ascii="Menlo" w:hAnsi="Menlo"/>
-                <w:color w:val="222222"/>
-                <w:sz w:val="17"/>
-              </w:rPr>
-              <w:t xml:space="preserve"> 10 │   let z = 0;</w:t>
-              <w:br/>
-            </w:r>
-            <w:r>
-              <w:rPr>
-                <w:rFonts w:ascii="Menlo" w:hAnsi="Menlo"/>
-                <w:color w:val="222222"/>
-                <w:sz w:val="17"/>
-              </w:rPr>
-              <w:t xml:space="preserve"> 11 │   for (let i = 0; i &lt; raw.length; i++) {</w:t>
-              <w:br/>
-            </w:r>
-            <w:r>
-              <w:rPr>
-                <w:rFonts w:ascii="Menlo" w:hAnsi="Menlo"/>
-                <w:color w:val="222222"/>
-                <w:sz w:val="17"/>
-              </w:rPr>
-              <w:t xml:space="preserve"> 12 │     const v = (raw[i] - means[i]) / sds[i];</w:t>
-              <w:br/>
-            </w:r>
-            <w:r>
-              <w:rPr>
-                <w:rFonts w:ascii="Menlo" w:hAnsi="Menlo"/>
-                <w:color w:val="222222"/>
-                <w:sz w:val="17"/>
-              </w:rPr>
-              <w:t xml:space="preserve"> 13 │     z += v * coefs[i];</w:t>
-              <w:br/>
-            </w:r>
-            <w:r>
-              <w:rPr>
-                <w:rFonts w:ascii="Menlo" w:hAnsi="Menlo"/>
-                <w:color w:val="222222"/>
-                <w:sz w:val="17"/>
-              </w:rPr>
-              <w:t xml:space="preserve"> 14 │   }</w:t>
-              <w:br/>
-            </w:r>
-            <w:r>
-              <w:rPr>
-                <w:rFonts w:ascii="Menlo" w:hAnsi="Menlo"/>
-                <w:color w:val="222222"/>
-                <w:sz w:val="17"/>
-              </w:rPr>
-              <w:t xml:space="preserve"> 15 │   z += intercept;</w:t>
-              <w:br/>
-            </w:r>
-            <w:r>
-              <w:rPr>
-                <w:rFonts w:ascii="Menlo" w:hAnsi="Menlo"/>
-                <w:color w:val="222222"/>
-                <w:sz w:val="17"/>
-              </w:rPr>
-              <w:t xml:space="preserve"> 16 │   const p = 1 / (1 + Math.exp(-z));</w:t>
-              <w:br/>
-            </w:r>
-            <w:r>
-              <w:rPr>
-                <w:rFonts w:ascii="Menlo" w:hAnsi="Menlo"/>
-                <w:color w:val="222222"/>
-                <w:sz w:val="17"/>
-              </w:rPr>
-              <w:t xml:space="preserve"> 17 │   document.getElementById("prob").textContent = (p * 100).toFixed(1) + "%";</w:t>
-              <w:br/>
-            </w:r>
-            <w:r>
-              <w:rPr>
-                <w:rFonts w:ascii="Menlo" w:hAnsi="Menlo"/>
-                <w:color w:val="222222"/>
-                <w:sz w:val="17"/>
-              </w:rPr>
-              <w:t xml:space="preserve"> 18 │   document.getElementById("prob-meta").textContent =</w:t>
-              <w:br/>
-            </w:r>
-            <w:r>
-              <w:rPr>
-                <w:rFonts w:ascii="Menlo" w:hAnsi="Menlo"/>
-                <w:color w:val="222222"/>
-                <w:sz w:val="17"/>
-              </w:rPr>
-              <w:t xml:space="preserve"> 19 │     "Logit = " + z.toFixed(3) + " · ratio vs prevalence (7.3%): " +</w:t>
-              <w:br/>
-            </w:r>
-            <w:r>
-              <w:rPr>
-                <w:rFonts w:ascii="Menlo" w:hAnsi="Menlo"/>
-                <w:color w:val="222222"/>
-                <w:sz w:val="17"/>
-              </w:rPr>
-              <w:t xml:space="preserve"> 20 │     (p / 0.073).toFixed(2) + "×";</w:t>
-              <w:br/>
-            </w:r>
-            <w:r>
-              <w:rPr>
-                <w:rFonts w:ascii="Menlo" w:hAnsi="Menlo"/>
-                <w:color w:val="222222"/>
-                <w:sz w:val="17"/>
-              </w:rPr>
-              <w:t xml:space="preserve"> 21 │ </w:t>
-              <w:br/>
-            </w:r>
-            <w:r>
-              <w:rPr>
-                <w:rFonts w:ascii="Menlo" w:hAnsi="Menlo"/>
-                <w:color w:val="222222"/>
-                <w:sz w:val="17"/>
-              </w:rPr>
-              <w:t xml:space="preserve"> 22 │   // Conformal sets</w:t>
-              <w:br/>
-            </w:r>
-            <w:r>
-              <w:rPr>
-                <w:rFonts w:ascii="Menlo" w:hAnsi="Menlo"/>
-                <w:color w:val="222222"/>
-                <w:sz w:val="17"/>
-              </w:rPr>
-              <w:t xml:space="preserve"> 23 │   const alpha = parseFloat(document.getElementById("alpha").value);</w:t>
-              <w:br/>
-            </w:r>
-            <w:r>
-              <w:rPr>
-                <w:rFonts w:ascii="Menlo" w:hAnsi="Menlo"/>
-                <w:color w:val="222222"/>
-                <w:sz w:val="17"/>
-              </w:rPr>
-              <w:t xml:space="preserve"> 24 │   const aKey = "alpha_" + alpha.toFixed(2);</w:t>
-              <w:br/>
-            </w:r>
-            <w:r>
-              <w:rPr>
-                <w:rFonts w:ascii="Menlo" w:hAnsi="Menlo"/>
-                <w:color w:val="222222"/>
-                <w:sz w:val="17"/>
-              </w:rPr>
-              <w:t xml:space="preserve"> 25 │   const qPos = MODEL.conformal.nonconformity_quantiles_positive[aKey];</w:t>
-              <w:br/>
-            </w:r>
-            <w:r>
-              <w:rPr>
-                <w:rFonts w:ascii="Menlo" w:hAnsi="Menlo"/>
-                <w:color w:val="222222"/>
-                <w:sz w:val="17"/>
-              </w:rPr>
-              <w:t xml:space="preserve"> 26 │   const qNeg = MODEL.conformal.nonconformity_quantiles_negative[aKey];</w:t>
-              <w:br/>
-            </w:r>
-            <w:r>
-              <w:rPr>
-                <w:rFonts w:ascii="Menlo" w:hAnsi="Menlo"/>
-                <w:color w:val="222222"/>
-                <w:sz w:val="17"/>
-              </w:rPr>
-              <w:t xml:space="preserve"> 27 │   const incPos = (1 - p) &lt;= qPos;       // include "seizure"</w:t>
-              <w:br/>
-            </w:r>
-            <w:r>
-              <w:rPr>
-                <w:rFonts w:ascii="Menlo" w:hAnsi="Menlo"/>
-                <w:color w:val="222222"/>
-                <w:sz w:val="17"/>
-              </w:rPr>
-              <w:t xml:space="preserve"> 28 │   const incNeg = (1 - (1 - p)) &lt;= qNeg; // include "no seizure"  i.e.  p &lt;= qNeg</w:t>
-              <w:br/>
-            </w:r>
-            <w:r>
-              <w:rPr>
-                <w:rFonts w:ascii="Menlo" w:hAnsi="Menlo"/>
-                <w:color w:val="222222"/>
-                <w:sz w:val="17"/>
-              </w:rPr>
-              <w:t xml:space="preserve"> 29 │   let setLabel, recClass, recText;</w:t>
-              <w:br/>
-            </w:r>
-            <w:r>
-              <w:rPr>
-                <w:rFonts w:ascii="Menlo" w:hAnsi="Menlo"/>
-                <w:color w:val="222222"/>
-                <w:sz w:val="17"/>
-              </w:rPr>
-              <w:t xml:space="preserve"> 30 │   if (incPos &amp;&amp; !incNeg) {</w:t>
-              <w:br/>
-            </w:r>
-            <w:r>
-              <w:rPr>
-                <w:rFonts w:ascii="Menlo" w:hAnsi="Menlo"/>
-                <w:color w:val="222222"/>
-                <w:sz w:val="17"/>
-              </w:rPr>
-              <w:t xml:space="preserve"> 31 │     setLabel = "{ seizure }";</w:t>
-              <w:br/>
-            </w:r>
-            <w:r>
-              <w:rPr>
-                <w:rFonts w:ascii="Menlo" w:hAnsi="Menlo"/>
-                <w:color w:val="222222"/>
-                <w:sz w:val="17"/>
-              </w:rPr>
-              <w:t xml:space="preserve"> 32 │     recClass = "rulein";</w:t>
-              <w:br/>
-            </w:r>
-            <w:r>
-              <w:rPr>
-                <w:rFonts w:ascii="Menlo" w:hAnsi="Menlo"/>
-                <w:color w:val="222222"/>
-                <w:sz w:val="17"/>
-              </w:rPr>
-              <w:t xml:space="preserve"> 33 │     recText = "RULE-IN. At the selected confidence level, this patient is "</w:t>
-              <w:br/>
-            </w:r>
-            <w:r>
-              <w:rPr>
-                <w:rFonts w:ascii="Menlo" w:hAnsi="Menlo"/>
-                <w:color w:val="222222"/>
-                <w:sz w:val="17"/>
-              </w:rPr>
-              <w:t xml:space="preserve"> 34 │              + "classified as high-risk for postoperative seizure. Consider "</w:t>
-              <w:br/>
-            </w:r>
-            <w:r>
-              <w:rPr>
-                <w:rFonts w:ascii="Menlo" w:hAnsi="Menlo"/>
-                <w:color w:val="222222"/>
-                <w:sz w:val="17"/>
-              </w:rPr>
-              <w:t xml:space="preserve"> 35 │              + "AED prophylaxis and/or continuous EEG monitoring.";</w:t>
-              <w:br/>
-            </w:r>
-            <w:r>
-              <w:rPr>
-                <w:rFonts w:ascii="Menlo" w:hAnsi="Menlo"/>
-                <w:color w:val="222222"/>
-                <w:sz w:val="17"/>
-              </w:rPr>
-              <w:t xml:space="preserve"> 36 │   } else if (!incPos &amp;&amp; incNeg) {</w:t>
-              <w:br/>
-            </w:r>
-            <w:r>
-              <w:rPr>
-                <w:rFonts w:ascii="Menlo" w:hAnsi="Menlo"/>
-                <w:color w:val="222222"/>
-                <w:sz w:val="17"/>
-              </w:rPr>
-              <w:t xml:space="preserve"> 37 │     setLabel = "{ no seizure }";</w:t>
-              <w:br/>
-            </w:r>
-            <w:r>
-              <w:rPr>
-                <w:rFonts w:ascii="Menlo" w:hAnsi="Menlo"/>
-                <w:color w:val="222222"/>
-                <w:sz w:val="17"/>
-              </w:rPr>
-              <w:t xml:space="preserve"> 38 │     recClass = "ruleout";</w:t>
-              <w:br/>
-            </w:r>
-            <w:r>
-              <w:rPr>
-                <w:rFonts w:ascii="Menlo" w:hAnsi="Menlo"/>
-                <w:color w:val="222222"/>
-                <w:sz w:val="17"/>
-              </w:rPr>
-              <w:t xml:space="preserve"> 39 │     recText = "RULE-OUT. At the selected confidence level, postoperative "</w:t>
-              <w:br/>
-            </w:r>
-            <w:r>
-              <w:rPr>
-                <w:rFonts w:ascii="Menlo" w:hAnsi="Menlo"/>
-                <w:color w:val="222222"/>
-                <w:sz w:val="17"/>
-              </w:rPr>
-              <w:t xml:space="preserve"> 40 │              + "seizure can be confidently ruled out. AED prophylaxis may "</w:t>
-              <w:br/>
-            </w:r>
-            <w:r>
-              <w:rPr>
-                <w:rFonts w:ascii="Menlo" w:hAnsi="Menlo"/>
-                <w:color w:val="222222"/>
-                <w:sz w:val="17"/>
-              </w:rPr>
-              <w:t xml:space="preserve"> 41 │              + "be safely omitted, with routine clinical observation.";</w:t>
-              <w:br/>
-            </w:r>
-            <w:r>
-              <w:rPr>
-                <w:rFonts w:ascii="Menlo" w:hAnsi="Menlo"/>
-                <w:color w:val="222222"/>
-                <w:sz w:val="17"/>
-              </w:rPr>
-              <w:t xml:space="preserve"> 42 │   } else if (incPos &amp;&amp; incNeg) {</w:t>
-              <w:br/>
-            </w:r>
-            <w:r>
-              <w:rPr>
-                <w:rFonts w:ascii="Menlo" w:hAnsi="Menlo"/>
-                <w:color w:val="222222"/>
-                <w:sz w:val="17"/>
-              </w:rPr>
-              <w:t xml:space="preserve"> 43 │     setLabel = "{ seizure, no seizure }";</w:t>
-              <w:br/>
-            </w:r>
-            <w:r>
-              <w:rPr>
-                <w:rFonts w:ascii="Menlo" w:hAnsi="Menlo"/>
-                <w:color w:val="222222"/>
-                <w:sz w:val="17"/>
-              </w:rPr>
-              <w:t xml:space="preserve"> 44 │     recClass = "indeterminate";</w:t>
-              <w:br/>
-            </w:r>
-            <w:r>
-              <w:rPr>
-                <w:rFonts w:ascii="Menlo" w:hAnsi="Menlo"/>
-                <w:color w:val="222222"/>
-                <w:sz w:val="17"/>
-              </w:rPr>
-              <w:t xml:space="preserve"> 45 │     recText = "INDETERMINATE. The model cannot provide a confident "</w:t>
-              <w:br/>
-            </w:r>
-            <w:r>
-              <w:rPr>
-                <w:rFonts w:ascii="Menlo" w:hAnsi="Menlo"/>
-                <w:color w:val="222222"/>
-                <w:sz w:val="17"/>
-              </w:rPr>
-              <w:t xml:space="preserve"> 46 │              + "singleton prediction at this α. Clinical judgment should "</w:t>
-              <w:br/>
-            </w:r>
-            <w:r>
-              <w:rPr>
-                <w:rFonts w:ascii="Menlo" w:hAnsi="Menlo"/>
-                <w:color w:val="222222"/>
-                <w:sz w:val="17"/>
-              </w:rPr>
-              <w:t xml:space="preserve"> 47 │              + "guide the AED-vs-monitoring decision.";</w:t>
-              <w:br/>
-            </w:r>
-            <w:r>
-              <w:rPr>
-                <w:rFonts w:ascii="Menlo" w:hAnsi="Menlo"/>
-                <w:color w:val="222222"/>
-                <w:sz w:val="17"/>
-              </w:rPr>
-              <w:t xml:space="preserve"> 48 │   } else {</w:t>
-              <w:br/>
-            </w:r>
-            <w:r>
-              <w:rPr>
-                <w:rFonts w:ascii="Menlo" w:hAnsi="Menlo"/>
-                <w:color w:val="222222"/>
-                <w:sz w:val="17"/>
-              </w:rPr>
-              <w:t xml:space="preserve"> 49 │     setLabel = "{ ∅ }";</w:t>
-              <w:br/>
-            </w:r>
-            <w:r>
-              <w:rPr>
-                <w:rFonts w:ascii="Menlo" w:hAnsi="Menlo"/>
-                <w:color w:val="222222"/>
-                <w:sz w:val="17"/>
-              </w:rPr>
-              <w:t xml:space="preserve"> 50 │     recClass = "indeterminate";</w:t>
-              <w:br/>
-            </w:r>
-            <w:r>
-              <w:rPr>
-                <w:rFonts w:ascii="Menlo" w:hAnsi="Menlo"/>
-                <w:color w:val="222222"/>
-                <w:sz w:val="17"/>
-              </w:rPr>
-              <w:t xml:space="preserve"> 51 │     recText = "NULL SET. Neither class is supported at this α — interpret "</w:t>
-              <w:br/>
-            </w:r>
-            <w:r>
-              <w:rPr>
-                <w:rFonts w:ascii="Menlo" w:hAnsi="Menlo"/>
-                <w:color w:val="222222"/>
-                <w:sz w:val="17"/>
-              </w:rPr>
-              <w:t xml:space="preserve"> 52 │              + "as an outlier relative to the calibration set.";</w:t>
-              <w:br/>
-            </w:r>
-            <w:r>
-              <w:rPr>
-                <w:rFonts w:ascii="Menlo" w:hAnsi="Menlo"/>
-                <w:color w:val="222222"/>
-                <w:sz w:val="17"/>
-              </w:rPr>
-              <w:t xml:space="preserve"> 53 │   }</w:t>
-              <w:br/>
-            </w:r>
-            <w:r>
-              <w:rPr>
-                <w:rFonts w:ascii="Menlo" w:hAnsi="Menlo"/>
-                <w:color w:val="222222"/>
-                <w:sz w:val="17"/>
-              </w:rPr>
-              <w:t xml:space="preserve"> 54 │   const ps = document.getElementById("pred-set");</w:t>
-              <w:br/>
-            </w:r>
-            <w:r>
-              <w:rPr>
-                <w:rFonts w:ascii="Menlo" w:hAnsi="Menlo"/>
-                <w:color w:val="222222"/>
-                <w:sz w:val="17"/>
-              </w:rPr>
-              <w:t xml:space="preserve"> 55 │   ps.textContent = setLabel;</w:t>
-              <w:br/>
-            </w:r>
-            <w:r>
-              <w:rPr>
-                <w:rFonts w:ascii="Menlo" w:hAnsi="Menlo"/>
-                <w:color w:val="222222"/>
-                <w:sz w:val="17"/>
-              </w:rPr>
-              <w:t xml:space="preserve"> 56 │   ps.parentElement.className = "result-card " +</w:t>
-              <w:br/>
-            </w:r>
-            <w:r>
-              <w:rPr>
-                <w:rFonts w:ascii="Menlo" w:hAnsi="Menlo"/>
-                <w:color w:val="222222"/>
-                <w:sz w:val="17"/>
-              </w:rPr>
-              <w:t xml:space="preserve"> 57 │     (recClass === "ruleout" ? "forest" : recClass === "rulein" ? "rust" : "");</w:t>
-              <w:br/>
-            </w:r>
-            <w:r>
-              <w:rPr>
-                <w:rFonts w:ascii="Menlo" w:hAnsi="Menlo"/>
-                <w:color w:val="222222"/>
-                <w:sz w:val="17"/>
-              </w:rPr>
-              <w:t xml:space="preserve"> 58 │   document.getElementById("pred-set").className = "big " +</w:t>
-              <w:br/>
-            </w:r>
-            <w:r>
-              <w:rPr>
-                <w:rFonts w:ascii="Menlo" w:hAnsi="Menlo"/>
-                <w:color w:val="222222"/>
-                <w:sz w:val="17"/>
-              </w:rPr>
-              <w:t xml:space="preserve"> 59 │     (recClass === "ruleout" ? "forest" : recClass === "rulein" ? "rust" : "");</w:t>
-              <w:br/>
-            </w:r>
-            <w:r>
-              <w:rPr>
-                <w:rFonts w:ascii="Menlo" w:hAnsi="Menlo"/>
-                <w:color w:val="222222"/>
-                <w:sz w:val="17"/>
-              </w:rPr>
-              <w:t xml:space="preserve"> 60 │   document.getElementById("pred-set-meta").textContent =</w:t>
-              <w:br/>
-            </w:r>
-            <w:r>
-              <w:rPr>
-                <w:rFonts w:ascii="Menlo" w:hAnsi="Menlo"/>
-                <w:color w:val="222222"/>
-                <w:sz w:val="17"/>
-              </w:rPr>
-              <w:t xml:space="preserve"> 61 │     "α = " + alpha.toFixed(2) + " → " + ((1 - alpha) * 100).toFixed(0) + "% coverage";</w:t>
-              <w:br/>
-            </w:r>
-            <w:r>
-              <w:rPr>
-                <w:rFonts w:ascii="Menlo" w:hAnsi="Menlo"/>
-                <w:color w:val="222222"/>
-                <w:sz w:val="17"/>
-              </w:rPr>
-              <w:t xml:space="preserve"> 62 │ </w:t>
-              <w:br/>
-            </w:r>
-            <w:r>
-              <w:rPr>
-                <w:rFonts w:ascii="Menlo" w:hAnsi="Menlo"/>
-                <w:color w:val="222222"/>
-                <w:sz w:val="17"/>
-              </w:rPr>
-              <w:t xml:space="preserve"> 63 │   const rec = document.getElementById("recommendation");</w:t>
-              <w:br/>
-            </w:r>
-            <w:r>
-              <w:rPr>
-                <w:rFonts w:ascii="Menlo" w:hAnsi="Menlo"/>
-                <w:color w:val="222222"/>
-                <w:sz w:val="17"/>
-              </w:rPr>
-              <w:t xml:space="preserve"> 64 │   rec.className = "recommendation " + recClass;</w:t>
-              <w:br/>
-            </w:r>
-            <w:r>
-              <w:rPr>
-                <w:rFonts w:ascii="Menlo" w:hAnsi="Menlo"/>
-                <w:color w:val="222222"/>
-                <w:sz w:val="17"/>
-              </w:rPr>
-              <w:t xml:space="preserve"> 65 │   document.getElementById("rec-text").textContent = recText;</w:t>
-              <w:br/>
-            </w:r>
-            <w:r>
-              <w:rPr>
-                <w:rFonts w:ascii="Menlo" w:hAnsi="Menlo"/>
-                <w:color w:val="222222"/>
-                <w:sz w:val="17"/>
-              </w:rPr>
-              <w:t xml:space="preserve"> 66 │ </w:t>
-              <w:br/>
-            </w:r>
-            <w:r>
-              <w:rPr>
-                <w:rFonts w:ascii="Menlo" w:hAnsi="Menlo"/>
-                <w:color w:val="222222"/>
-                <w:sz w:val="17"/>
-              </w:rPr>
-              <w:t xml:space="preserve"> 67 │   document.getElementById("alpha-fill").style.width =</w:t>
-              <w:br/>
-            </w:r>
-            <w:r>
-              <w:rPr>
-                <w:rFonts w:ascii="Menlo" w:hAnsi="Menlo"/>
-                <w:color w:val="222222"/>
-                <w:sz w:val="17"/>
-              </w:rPr>
-              <w:t xml:space="preserve"> 68 │     ((alpha - 0.05) / 0.15 * 100) + "%";</w:t>
-              <w:br/>
-            </w:r>
-            <w:r>
-              <w:rPr>
-                <w:rFonts w:ascii="Menlo" w:hAnsi="Menlo"/>
-                <w:color w:val="222222"/>
-                <w:sz w:val="17"/>
-              </w:rPr>
-              <w:t xml:space="preserve"> 69 │   document.getElementById("alpha-meta").textContent =</w:t>
-              <w:br/>
-            </w:r>
-            <w:r>
-              <w:rPr>
-                <w:rFonts w:ascii="Menlo" w:hAnsi="Menlo"/>
-                <w:color w:val="222222"/>
-                <w:sz w:val="17"/>
-              </w:rPr>
-              <w:t xml:space="preserve"> 70 │     "α = " + alpha.toFixed(2) + " → coverage guarantee " +</w:t>
-              <w:br/>
-            </w:r>
-            <w:r>
-              <w:rPr>
-                <w:rFonts w:ascii="Menlo" w:hAnsi="Menlo"/>
-                <w:color w:val="222222"/>
-                <w:sz w:val="17"/>
-              </w:rPr>
-              <w:t xml:space="preserve"> 71 │   ... (2 more lines elided — see full script in scripts/) ...</w:t>
+              <w:t xml:space="preserve">  3 │   const raw = FEATURES.map(f =&gt; val(f));</w:t>
+              <w:br/>
+            </w:r>
+            <w:r>
+              <w:rPr>
+                <w:rFonts w:ascii="Menlo" w:hAnsi="Menlo"/>
+                <w:color w:val="222222"/>
+                <w:sz w:val="17"/>
+              </w:rPr>
+              <w:t xml:space="preserve">  4 │   const M = MODEL.model;</w:t>
+              <w:br/>
+            </w:r>
+            <w:r>
+              <w:rPr>
+                <w:rFonts w:ascii="Menlo" w:hAnsi="Menlo"/>
+                <w:color w:val="222222"/>
+                <w:sz w:val="17"/>
+              </w:rPr>
+              <w:t xml:space="preserve">  5 │   let z = 0;</w:t>
+              <w:br/>
+            </w:r>
+            <w:r>
+              <w:rPr>
+                <w:rFonts w:ascii="Menlo" w:hAnsi="Menlo"/>
+                <w:color w:val="222222"/>
+                <w:sz w:val="17"/>
+              </w:rPr>
+              <w:t xml:space="preserve">  6 │   for (let i = 0; i &lt; raw.length; i++) {</w:t>
+              <w:br/>
+            </w:r>
+            <w:r>
+              <w:rPr>
+                <w:rFonts w:ascii="Menlo" w:hAnsi="Menlo"/>
+                <w:color w:val="222222"/>
+                <w:sz w:val="17"/>
+              </w:rPr>
+              <w:t xml:space="preserve">  7 │     z += ((raw[i] - M.feature_means[i]) / M.feature_sds[i]) * M.coefficients[i];</w:t>
+              <w:br/>
+            </w:r>
+            <w:r>
+              <w:rPr>
+                <w:rFonts w:ascii="Menlo" w:hAnsi="Menlo"/>
+                <w:color w:val="222222"/>
+                <w:sz w:val="17"/>
+              </w:rPr>
+              <w:t xml:space="preserve">  8 │   }</w:t>
+              <w:br/>
+            </w:r>
+            <w:r>
+              <w:rPr>
+                <w:rFonts w:ascii="Menlo" w:hAnsi="Menlo"/>
+                <w:color w:val="222222"/>
+                <w:sz w:val="17"/>
+              </w:rPr>
+              <w:t xml:space="preserve">  9 │   z += M.intercept;</w:t>
+              <w:br/>
+            </w:r>
+            <w:r>
+              <w:rPr>
+                <w:rFonts w:ascii="Menlo" w:hAnsi="Menlo"/>
+                <w:color w:val="222222"/>
+                <w:sz w:val="17"/>
+              </w:rPr>
+              <w:t xml:space="preserve"> 10 │   const p = 1 / (1 + Math.exp(-z));</w:t>
+              <w:br/>
+            </w:r>
+            <w:r>
+              <w:rPr>
+                <w:rFonts w:ascii="Menlo" w:hAnsi="Menlo"/>
+                <w:color w:val="222222"/>
+                <w:sz w:val="17"/>
+              </w:rPr>
+              <w:t xml:space="preserve"> 11 │   document.getElementById("kpi-prob").textContent = fmtPct(p);</w:t>
+              <w:br/>
+            </w:r>
+            <w:r>
+              <w:rPr>
+                <w:rFonts w:ascii="Menlo" w:hAnsi="Menlo"/>
+                <w:color w:val="222222"/>
+                <w:sz w:val="17"/>
+              </w:rPr>
+              <w:t xml:space="preserve"> 12 │   document.getElementById("kpi-prob-ratio").textContent =</w:t>
+              <w:br/>
+            </w:r>
+            <w:r>
+              <w:rPr>
+                <w:rFonts w:ascii="Menlo" w:hAnsi="Menlo"/>
+                <w:color w:val="222222"/>
+                <w:sz w:val="17"/>
+              </w:rPr>
+              <w:t xml:space="preserve"> 13 │     (p / MODEL.metadata.prevalence).toFixed(2) + "× prevalence";</w:t>
+              <w:br/>
+            </w:r>
+            <w:r>
+              <w:rPr>
+                <w:rFonts w:ascii="Menlo" w:hAnsi="Menlo"/>
+                <w:color w:val="222222"/>
+                <w:sz w:val="17"/>
+              </w:rPr>
+              <w:t xml:space="preserve"> 14 │   document.getElementById("kpi-prob-meta").textContent =</w:t>
+              <w:br/>
+            </w:r>
+            <w:r>
+              <w:rPr>
+                <w:rFonts w:ascii="Menlo" w:hAnsi="Menlo"/>
+                <w:color w:val="222222"/>
+                <w:sz w:val="17"/>
+              </w:rPr>
+              <w:t xml:space="preserve"> 15 │     "Logit = " + z.toFixed(3) + " · base rate 7.3%";</w:t>
+              <w:br/>
+            </w:r>
+            <w:r>
+              <w:rPr>
+                <w:rFonts w:ascii="Menlo" w:hAnsi="Menlo"/>
+                <w:color w:val="222222"/>
+                <w:sz w:val="17"/>
+              </w:rPr>
+              <w:t xml:space="preserve"> 16 │ </w:t>
+              <w:br/>
+            </w:r>
+            <w:r>
+              <w:rPr>
+                <w:rFonts w:ascii="Menlo" w:hAnsi="Menlo"/>
+                <w:color w:val="222222"/>
+                <w:sz w:val="17"/>
+              </w:rPr>
+              <w:t xml:space="preserve"> 17 │   const alpha = parseFloat(document.getElementById("alpha").value);</w:t>
+              <w:br/>
+            </w:r>
+            <w:r>
+              <w:rPr>
+                <w:rFonts w:ascii="Menlo" w:hAnsi="Menlo"/>
+                <w:color w:val="222222"/>
+                <w:sz w:val="17"/>
+              </w:rPr>
+              <w:t xml:space="preserve"> 18 │   const aKey  = "alpha_" + alpha.toFixed(2);</w:t>
+              <w:br/>
+            </w:r>
+            <w:r>
+              <w:rPr>
+                <w:rFonts w:ascii="Menlo" w:hAnsi="Menlo"/>
+                <w:color w:val="222222"/>
+                <w:sz w:val="17"/>
+              </w:rPr>
+              <w:t xml:space="preserve"> 19 │   const qPos  = MODEL.conformal.nonconformity_quantiles_positive[aKey];</w:t>
+              <w:br/>
+            </w:r>
+            <w:r>
+              <w:rPr>
+                <w:rFonts w:ascii="Menlo" w:hAnsi="Menlo"/>
+                <w:color w:val="222222"/>
+                <w:sz w:val="17"/>
+              </w:rPr>
+              <w:t xml:space="preserve"> 20 │   const qNeg  = MODEL.conformal.nonconformity_quantiles_negative[aKey];</w:t>
+              <w:br/>
+            </w:r>
+            <w:r>
+              <w:rPr>
+                <w:rFonts w:ascii="Menlo" w:hAnsi="Menlo"/>
+                <w:color w:val="222222"/>
+                <w:sz w:val="17"/>
+              </w:rPr>
+              <w:t xml:space="preserve"> 21 │   const incPos = (1 - p) &lt;= qPos;</w:t>
+              <w:br/>
+            </w:r>
+            <w:r>
+              <w:rPr>
+                <w:rFonts w:ascii="Menlo" w:hAnsi="Menlo"/>
+                <w:color w:val="222222"/>
+                <w:sz w:val="17"/>
+              </w:rPr>
+              <w:t xml:space="preserve"> 22 │   const incNeg = p &lt;= qNeg;</w:t>
+              <w:br/>
+            </w:r>
+            <w:r>
+              <w:rPr>
+                <w:rFonts w:ascii="Menlo" w:hAnsi="Menlo"/>
+                <w:color w:val="222222"/>
+                <w:sz w:val="17"/>
+              </w:rPr>
+              <w:t xml:space="preserve"> 23 │ </w:t>
+              <w:br/>
+            </w:r>
+            <w:r>
+              <w:rPr>
+                <w:rFonts w:ascii="Menlo" w:hAnsi="Menlo"/>
+                <w:color w:val="222222"/>
+                <w:sz w:val="17"/>
+              </w:rPr>
+              <w:t xml:space="preserve"> 24 │   let label, recText, palette;</w:t>
+              <w:br/>
+            </w:r>
+            <w:r>
+              <w:rPr>
+                <w:rFonts w:ascii="Menlo" w:hAnsi="Menlo"/>
+                <w:color w:val="222222"/>
+                <w:sz w:val="17"/>
+              </w:rPr>
+              <w:t xml:space="preserve"> 25 │   if (incPos &amp;&amp; !incNeg) {</w:t>
+              <w:br/>
+            </w:r>
+            <w:r>
+              <w:rPr>
+                <w:rFonts w:ascii="Menlo" w:hAnsi="Menlo"/>
+                <w:color w:val="222222"/>
+                <w:sz w:val="17"/>
+              </w:rPr>
+              <w:t xml:space="preserve"> 26 │     label = "{ seizure }"; palette = "rust";</w:t>
+              <w:br/>
+            </w:r>
+            <w:r>
+              <w:rPr>
+                <w:rFonts w:ascii="Menlo" w:hAnsi="Menlo"/>
+                <w:color w:val="222222"/>
+                <w:sz w:val="17"/>
+              </w:rPr>
+              <w:t xml:space="preserve"> 27 │     recText = "RULE-IN. At the chosen confidence level the patient is high-risk. Consider AED prophylaxis and/or continuous EEG monitoring.";</w:t>
+              <w:br/>
+            </w:r>
+            <w:r>
+              <w:rPr>
+                <w:rFonts w:ascii="Menlo" w:hAnsi="Menlo"/>
+                <w:color w:val="222222"/>
+                <w:sz w:val="17"/>
+              </w:rPr>
+              <w:t xml:space="preserve"> 28 │   } else if (!incPos &amp;&amp; incNeg) {</w:t>
+              <w:br/>
+            </w:r>
+            <w:r>
+              <w:rPr>
+                <w:rFonts w:ascii="Menlo" w:hAnsi="Menlo"/>
+                <w:color w:val="222222"/>
+                <w:sz w:val="17"/>
+              </w:rPr>
+              <w:t xml:space="preserve"> 29 │     label = "{ no seizure }"; palette = "forest";</w:t>
+              <w:br/>
+            </w:r>
+            <w:r>
+              <w:rPr>
+                <w:rFonts w:ascii="Menlo" w:hAnsi="Menlo"/>
+                <w:color w:val="222222"/>
+                <w:sz w:val="17"/>
+              </w:rPr>
+              <w:t xml:space="preserve"> 30 │     recText = "RULE-OUT. At the chosen confidence level postoperative seizure can be confidently ruled out. AED prophylaxis may be safely omitted with routine observation.";</w:t>
+              <w:br/>
+            </w:r>
+            <w:r>
+              <w:rPr>
+                <w:rFonts w:ascii="Menlo" w:hAnsi="Menlo"/>
+                <w:color w:val="222222"/>
+                <w:sz w:val="17"/>
+              </w:rPr>
+              <w:t xml:space="preserve"> 31 │   } else if (incPos &amp;&amp; incNeg) {</w:t>
+              <w:br/>
+            </w:r>
+            <w:r>
+              <w:rPr>
+                <w:rFonts w:ascii="Menlo" w:hAnsi="Menlo"/>
+                <w:color w:val="222222"/>
+                <w:sz w:val="17"/>
+              </w:rPr>
+              <w:t xml:space="preserve"> 32 │     label = "{ seizure, no seizure }"; palette = "ochre";</w:t>
+              <w:br/>
+            </w:r>
+            <w:r>
+              <w:rPr>
+                <w:rFonts w:ascii="Menlo" w:hAnsi="Menlo"/>
+                <w:color w:val="222222"/>
+                <w:sz w:val="17"/>
+              </w:rPr>
+              <w:t xml:space="preserve"> 33 │     recText = "INDETERMINATE. The model cannot give a confident singleton prediction at this α. Clinical judgment should guide the AED-vs-monitoring decision.";</w:t>
+              <w:br/>
+            </w:r>
+            <w:r>
+              <w:rPr>
+                <w:rFonts w:ascii="Menlo" w:hAnsi="Menlo"/>
+                <w:color w:val="222222"/>
+                <w:sz w:val="17"/>
+              </w:rPr>
+              <w:t xml:space="preserve"> 34 │   } else {</w:t>
+              <w:br/>
+            </w:r>
+            <w:r>
+              <w:rPr>
+                <w:rFonts w:ascii="Menlo" w:hAnsi="Menlo"/>
+                <w:color w:val="222222"/>
+                <w:sz w:val="17"/>
+              </w:rPr>
+              <w:t xml:space="preserve"> 35 │     label = "{ ∅ }"; palette = "ochre";</w:t>
+              <w:br/>
+            </w:r>
+            <w:r>
+              <w:rPr>
+                <w:rFonts w:ascii="Menlo" w:hAnsi="Menlo"/>
+                <w:color w:val="222222"/>
+                <w:sz w:val="17"/>
+              </w:rPr>
+              <w:t xml:space="preserve"> 36 │     recText = "NULL SET. Neither class is supported at this α — interpret as an outlier relative to the calibration set.";</w:t>
+              <w:br/>
+            </w:r>
+            <w:r>
+              <w:rPr>
+                <w:rFonts w:ascii="Menlo" w:hAnsi="Menlo"/>
+                <w:color w:val="222222"/>
+                <w:sz w:val="17"/>
+              </w:rPr>
+              <w:t xml:space="preserve"> 37 │   }</w:t>
+              <w:br/>
+            </w:r>
+            <w:r>
+              <w:rPr>
+                <w:rFonts w:ascii="Menlo" w:hAnsi="Menlo"/>
+                <w:color w:val="222222"/>
+                <w:sz w:val="17"/>
+              </w:rPr>
+              <w:t xml:space="preserve"> 38 │   document.getElementById("kpi-set").textContent = label;</w:t>
+              <w:br/>
+            </w:r>
+            <w:r>
+              <w:rPr>
+                <w:rFonts w:ascii="Menlo" w:hAnsi="Menlo"/>
+                <w:color w:val="222222"/>
+                <w:sz w:val="17"/>
+              </w:rPr>
+              <w:t xml:space="preserve"> 39 │   document.getElementById("kpi-set-meta").textContent =</w:t>
+              <w:br/>
+            </w:r>
+            <w:r>
+              <w:rPr>
+                <w:rFonts w:ascii="Menlo" w:hAnsi="Menlo"/>
+                <w:color w:val="222222"/>
+                <w:sz w:val="17"/>
+              </w:rPr>
+              <w:t xml:space="preserve"> 40 │     "α = " + alpha.toFixed(2) + " → " + ((1 - alpha) * 100).toFixed(0) + "% coverage";</w:t>
+              <w:br/>
+            </w:r>
+            <w:r>
+              <w:rPr>
+                <w:rFonts w:ascii="Menlo" w:hAnsi="Menlo"/>
+                <w:color w:val="222222"/>
+                <w:sz w:val="17"/>
+              </w:rPr>
+              <w:t xml:space="preserve"> 41 │ </w:t>
+              <w:br/>
+            </w:r>
+            <w:r>
+              <w:rPr>
+                <w:rFonts w:ascii="Menlo" w:hAnsi="Menlo"/>
+                <w:color w:val="222222"/>
+                <w:sz w:val="17"/>
+              </w:rPr>
+              <w:t xml:space="preserve"> 42 │   const recCard = document.getElementById("rec-card");</w:t>
+              <w:br/>
+            </w:r>
+            <w:r>
+              <w:rPr>
+                <w:rFonts w:ascii="Menlo" w:hAnsi="Menlo"/>
+                <w:color w:val="222222"/>
+                <w:sz w:val="17"/>
+              </w:rPr>
+              <w:t xml:space="preserve"> 43 │   recCard.classList.remove("bg-ochre-50","bg-rust-50","bg-forest-50",</w:t>
+              <w:br/>
+            </w:r>
+            <w:r>
+              <w:rPr>
+                <w:rFonts w:ascii="Menlo" w:hAnsi="Menlo"/>
+                <w:color w:val="222222"/>
+                <w:sz w:val="17"/>
+              </w:rPr>
+              <w:t xml:space="preserve"> 44 │                            "dark:bg-ochre-900/20","dark:bg-rust-900/20","dark:bg-forest-900/20",</w:t>
+              <w:br/>
+            </w:r>
+            <w:r>
+              <w:rPr>
+                <w:rFonts w:ascii="Menlo" w:hAnsi="Menlo"/>
+                <w:color w:val="222222"/>
+                <w:sz w:val="17"/>
+              </w:rPr>
+              <w:t xml:space="preserve"> 45 │                            "ring-ochre-700/30","ring-rust-700/30","ring-forest-700/30");</w:t>
+              <w:br/>
+            </w:r>
+            <w:r>
+              <w:rPr>
+                <w:rFonts w:ascii="Menlo" w:hAnsi="Menlo"/>
+                <w:color w:val="222222"/>
+                <w:sz w:val="17"/>
+              </w:rPr>
+              <w:t xml:space="preserve"> 46 │   recCard.classList.add(`bg-${palette}-50`, `dark:bg-${palette}-900/20`, `ring-${palette}-700/30`);</w:t>
+              <w:br/>
+            </w:r>
+            <w:r>
+              <w:rPr>
+                <w:rFonts w:ascii="Menlo" w:hAnsi="Menlo"/>
+                <w:color w:val="222222"/>
+                <w:sz w:val="17"/>
+              </w:rPr>
+              <w:t xml:space="preserve"> 47 │   const dt = recCard.querySelector("dt");</w:t>
+              <w:br/>
+            </w:r>
+            <w:r>
+              <w:rPr>
+                <w:rFonts w:ascii="Menlo" w:hAnsi="Menlo"/>
+                <w:color w:val="222222"/>
+                <w:sz w:val="17"/>
+              </w:rPr>
+              <w:t xml:space="preserve"> 48 │   dt.classList.remove("text-ochre-700","text-rust-700","text-forest-700",</w:t>
+              <w:br/>
+            </w:r>
+            <w:r>
+              <w:rPr>
+                <w:rFonts w:ascii="Menlo" w:hAnsi="Menlo"/>
+                <w:color w:val="222222"/>
+                <w:sz w:val="17"/>
+              </w:rPr>
+              <w:t xml:space="preserve"> 49 │                        "dark:text-ochre-500","dark:text-rust-500","dark:text-forest-500");</w:t>
+              <w:br/>
+            </w:r>
+            <w:r>
+              <w:rPr>
+                <w:rFonts w:ascii="Menlo" w:hAnsi="Menlo"/>
+                <w:color w:val="222222"/>
+                <w:sz w:val="17"/>
+              </w:rPr>
+              <w:t xml:space="preserve"> 50 │   dt.classList.add(`text-${palette}-700`, `dark:text-${palette}-500`);</w:t>
+              <w:br/>
+            </w:r>
+            <w:r>
+              <w:rPr>
+                <w:rFonts w:ascii="Menlo" w:hAnsi="Menlo"/>
+                <w:color w:val="222222"/>
+                <w:sz w:val="17"/>
+              </w:rPr>
+              <w:t xml:space="preserve"> 51 │ </w:t>
+              <w:br/>
+            </w:r>
+            <w:r>
+              <w:rPr>
+                <w:rFonts w:ascii="Menlo" w:hAnsi="Menlo"/>
+                <w:color w:val="222222"/>
+                <w:sz w:val="17"/>
+              </w:rPr>
+              <w:t xml:space="preserve"> 52 │   document.getElementById("rec-text").textContent = recText;</w:t>
+              <w:br/>
+            </w:r>
+            <w:r>
+              <w:rPr>
+                <w:rFonts w:ascii="Menlo" w:hAnsi="Menlo"/>
+                <w:color w:val="222222"/>
+                <w:sz w:val="17"/>
+              </w:rPr>
+              <w:t xml:space="preserve"> 53 │   document.getElementById("alpha-out").textContent = "α=" + alpha.toFixed(2);</w:t>
+              <w:br/>
+            </w:r>
+            <w:r>
+              <w:rPr>
+                <w:rFonts w:ascii="Menlo" w:hAnsi="Menlo"/>
+                <w:color w:val="222222"/>
+                <w:sz w:val="17"/>
+              </w:rPr>
+              <w:t xml:space="preserve"> 54 │   document.getElementById("alpha-meta").textContent =</w:t>
+              <w:br/>
+            </w:r>
+            <w:r>
+              <w:rPr>
+                <w:rFonts w:ascii="Menlo" w:hAnsi="Menlo"/>
+                <w:color w:val="222222"/>
+                <w:sz w:val="17"/>
+              </w:rPr>
+              <w:t xml:space="preserve"> 55 │     ((1 - alpha) * 100).toFixed(0) + "% coverage guarantee.";</w:t>
+              <w:br/>
+            </w:r>
+            <w:r>
+              <w:rPr>
+                <w:rFonts w:ascii="Menlo" w:hAnsi="Menlo"/>
+                <w:color w:val="222222"/>
+                <w:sz w:val="17"/>
+              </w:rPr>
+              <w:t xml:space="preserve"> 56 │ </w:t>
+              <w:br/>
+            </w:r>
+            <w:r>
+              <w:rPr>
+                <w:rFonts w:ascii="Menlo" w:hAnsi="Menlo"/>
+                <w:color w:val="222222"/>
+                <w:sz w:val="17"/>
+              </w:rPr>
+              <w:t xml:space="preserve"> 57 │   document.querySelectorAll(".alpha-pill").forEach(b =&gt; {</w:t>
+              <w:br/>
+            </w:r>
+            <w:r>
+              <w:rPr>
+                <w:rFonts w:ascii="Menlo" w:hAnsi="Menlo"/>
+                <w:color w:val="222222"/>
+                <w:sz w:val="17"/>
+              </w:rPr>
+              <w:t xml:space="preserve"> 58 │     const active = parseFloat(b.dataset.alpha) === alpha;</w:t>
+              <w:br/>
+            </w:r>
+            <w:r>
+              <w:rPr>
+                <w:rFonts w:ascii="Menlo" w:hAnsi="Menlo"/>
+                <w:color w:val="222222"/>
+                <w:sz w:val="17"/>
+              </w:rPr>
+              <w:t xml:space="preserve"> 59 │     b.classList.toggle("bg-navy-700", active);</w:t>
+              <w:br/>
+            </w:r>
+            <w:r>
+              <w:rPr>
+                <w:rFonts w:ascii="Menlo" w:hAnsi="Menlo"/>
+                <w:color w:val="222222"/>
+                <w:sz w:val="17"/>
+              </w:rPr>
+              <w:t xml:space="preserve"> 60 │     b.classList.toggle("text-white",  active);</w:t>
+              <w:br/>
+            </w:r>
+            <w:r>
+              <w:rPr>
+                <w:rFonts w:ascii="Menlo" w:hAnsi="Menlo"/>
+                <w:color w:val="222222"/>
+                <w:sz w:val="17"/>
+              </w:rPr>
+              <w:t xml:space="preserve"> 61 │     b.classList.toggle("ring-navy-700", active);</w:t>
+              <w:br/>
+            </w:r>
+            <w:r>
+              <w:rPr>
+                <w:rFonts w:ascii="Menlo" w:hAnsi="Menlo"/>
+                <w:color w:val="222222"/>
+                <w:sz w:val="17"/>
+              </w:rPr>
+              <w:t xml:space="preserve"> 62 │     b.setAttribute("aria-pressed", String(active));</w:t>
+              <w:br/>
+            </w:r>
+            <w:r>
+              <w:rPr>
+                <w:rFonts w:ascii="Menlo" w:hAnsi="Menlo"/>
+                <w:color w:val="222222"/>
+                <w:sz w:val="17"/>
+              </w:rPr>
+              <w:t xml:space="preserve"> 63 │   });</w:t>
+              <w:br/>
+            </w:r>
+            <w:r>
+              <w:rPr>
+                <w:rFonts w:ascii="Menlo" w:hAnsi="Menlo"/>
+                <w:color w:val="222222"/>
+                <w:sz w:val="17"/>
+              </w:rPr>
+              <w:t xml:space="preserve"> 64 │ }</w:t>
+              <w:br/>
+            </w:r>
+            <w:r>
+              <w:rPr>
+                <w:rFonts w:ascii="Menlo" w:hAnsi="Menlo"/>
+                <w:color w:val="222222"/>
+                <w:sz w:val="17"/>
+              </w:rPr>
+              <w:t xml:space="preserve"> 65 │ </w:t>
+              <w:br/>
+            </w:r>
+            <w:r>
+              <w:rPr>
+                <w:rFonts w:ascii="Menlo" w:hAnsi="Menlo"/>
+                <w:color w:val="222222"/>
+                <w:sz w:val="17"/>
+              </w:rPr>
+              <w:t xml:space="preserve"> 66 │ function resetDefaults() {</w:t>
+              <w:br/>
+            </w:r>
+            <w:r>
+              <w:rPr>
+                <w:rFonts w:ascii="Menlo" w:hAnsi="Menlo"/>
+                <w:color w:val="222222"/>
+                <w:sz w:val="17"/>
+              </w:rPr>
+              <w:t xml:space="preserve"> 67 │   for (const k in DEFAULTS) {</w:t>
+              <w:br/>
+            </w:r>
+            <w:r>
+              <w:rPr>
+                <w:rFonts w:ascii="Menlo" w:hAnsi="Menlo"/>
+                <w:color w:val="222222"/>
+                <w:sz w:val="17"/>
+              </w:rPr>
+              <w:t xml:space="preserve"> 68 │     const el = document.getElementById(k);</w:t>
+              <w:br/>
+            </w:r>
+            <w:r>
+              <w:rPr>
+                <w:rFonts w:ascii="Menlo" w:hAnsi="Menlo"/>
+                <w:color w:val="222222"/>
+                <w:sz w:val="17"/>
+              </w:rPr>
+              <w:t xml:space="preserve"> 69 │     if (el) el.value = DEFAULTS[k];</w:t>
+              <w:br/>
+            </w:r>
+            <w:r>
+              <w:rPr>
+                <w:rFonts w:ascii="Menlo" w:hAnsi="Menlo"/>
+                <w:color w:val="222222"/>
+                <w:sz w:val="17"/>
+              </w:rPr>
+              <w:t xml:space="preserve"> 70 │   }</w:t>
+              <w:br/>
+            </w:r>
+            <w:r>
+              <w:rPr>
+                <w:rFonts w:ascii="Menlo" w:hAnsi="Menlo"/>
+                <w:color w:val="222222"/>
+                <w:sz w:val="17"/>
+              </w:rPr>
+              <w:t xml:space="preserve"> 71 │   ... (10 more lines elided — see full script in scripts/) ...</w:t>
             </w:r>
           </w:p>
         </w:tc>

</xml_diff>